<commit_message>
Báo cáo: chỉ dùng một màu chữ đen
md2docx ép mọi màu chữ (kể cả màu theme trong styles mặc định của Word) về đen;
sinh lại 41 tệp .docx và xuất lại PDF báo cáo cuối.

Co-Authored-By: Claude Opus 5.5 <noreply@anthropic.com>
</commit_message>
<xml_diff>
--- a/SanPhamBanGiao/2_LuocDo_DataDictionary/data_contract.docx
+++ b/SanPhamBanGiao/2_LuocDo_DataDictionary/data_contract.docx
@@ -36,7 +36,7 @@
       <w:r>
         <w:rPr>
           <w:rFonts w:ascii="Consolas" w:hAnsi="Consolas"/>
-          <w:color w:val="8B1A1A"/>
+          <w:color w:val="000000"/>
           <w:sz w:val="19"/>
         </w:rPr>
         <w:t>docs/data_contract_v1.0.yaml</w:t>
@@ -47,7 +47,7 @@
       <w:r>
         <w:rPr>
           <w:rFonts w:ascii="Consolas" w:hAnsi="Consolas"/>
-          <w:color w:val="8B1A1A"/>
+          <w:color w:val="000000"/>
           <w:sz w:val="19"/>
         </w:rPr>
         <w:t>src/mdl/schema.py</w:t>
@@ -58,7 +58,7 @@
       <w:r>
         <w:rPr>
           <w:rFonts w:ascii="Consolas" w:hAnsi="Consolas"/>
-          <w:color w:val="8B1A1A"/>
+          <w:color w:val="000000"/>
           <w:sz w:val="19"/>
         </w:rPr>
         <w:t>scripts/xuat_data_contract.py</w:t>
@@ -78,7 +78,7 @@
       <w:r>
         <w:rPr>
           <w:rFonts w:ascii="Consolas" w:hAnsi="Consolas"/>
-          <w:color w:val="8B1A1A"/>
+          <w:color w:val="000000"/>
           <w:sz w:val="19"/>
         </w:rPr>
         <w:t>data_sample/curated/math_record_sample.parquet</w:t>
@@ -89,7 +89,7 @@
       <w:r>
         <w:rPr>
           <w:rFonts w:ascii="Consolas" w:hAnsi="Consolas"/>
-          <w:color w:val="8B1A1A"/>
+          <w:color w:val="000000"/>
           <w:sz w:val="19"/>
         </w:rPr>
         <w:t>record_id</w:t>
@@ -100,7 +100,7 @@
       <w:r>
         <w:rPr>
           <w:rFonts w:ascii="Consolas" w:hAnsi="Consolas"/>
-          <w:color w:val="8B1A1A"/>
+          <w:color w:val="000000"/>
           <w:sz w:val="19"/>
         </w:rPr>
         <w:t>python scripts/mdl.py sample</w:t>
@@ -125,7 +125,7 @@
       <w:r>
         <w:rPr>
           <w:rFonts w:ascii="Consolas" w:hAnsi="Consolas"/>
-          <w:color w:val="8B1A1A"/>
+          <w:color w:val="000000"/>
           <w:sz w:val="19"/>
         </w:rPr>
         <w:t>record_id</w:t>
@@ -136,7 +136,7 @@
       <w:r>
         <w:rPr>
           <w:rFonts w:ascii="Consolas" w:hAnsi="Consolas"/>
-          <w:color w:val="8B1A1A"/>
+          <w:color w:val="000000"/>
           <w:sz w:val="19"/>
         </w:rPr>
         <w:t>formal_statement</w:t>
@@ -147,7 +147,7 @@
       <w:r>
         <w:rPr>
           <w:rFonts w:ascii="Consolas" w:hAnsi="Consolas"/>
-          <w:color w:val="8B1A1A"/>
+          <w:color w:val="000000"/>
           <w:sz w:val="19"/>
         </w:rPr>
         <w:t>:=</w:t>
@@ -158,7 +158,7 @@
       <w:r>
         <w:rPr>
           <w:rFonts w:ascii="Consolas" w:hAnsi="Consolas"/>
-          <w:color w:val="8B1A1A"/>
+          <w:color w:val="000000"/>
           <w:sz w:val="19"/>
         </w:rPr>
         <w:t>_lake_log/</w:t>
@@ -205,7 +205,7 @@
       <w:r>
         <w:rPr>
           <w:rFonts w:ascii="Consolas" w:hAnsi="Consolas"/>
-          <w:color w:val="8B1A1A"/>
+          <w:color w:val="000000"/>
           <w:sz w:val="19"/>
         </w:rPr>
         <w:t>(record_id, source_version)</w:t>
@@ -216,7 +216,7 @@
       <w:r>
         <w:rPr>
           <w:rFonts w:ascii="Consolas" w:hAnsi="Consolas"/>
-          <w:color w:val="8B1A1A"/>
+          <w:color w:val="000000"/>
           <w:sz w:val="19"/>
         </w:rPr>
         <w:t>record_id = sha1(source + "|" + source_record_key)[:20]</w:t>
@@ -241,7 +241,7 @@
       <w:r>
         <w:rPr>
           <w:rFonts w:ascii="Consolas" w:hAnsi="Consolas"/>
-          <w:color w:val="8B1A1A"/>
+          <w:color w:val="000000"/>
           <w:sz w:val="19"/>
         </w:rPr>
         <w:t>record_id</w:t>
@@ -252,7 +252,7 @@
       <w:r>
         <w:rPr>
           <w:rFonts w:ascii="Consolas" w:hAnsi="Consolas"/>
-          <w:color w:val="8B1A1A"/>
+          <w:color w:val="000000"/>
           <w:sz w:val="19"/>
         </w:rPr>
         <w:t>source=&lt;..&gt;/source_version=&lt;..&gt;</w:t>
@@ -277,7 +277,7 @@
       <w:r>
         <w:rPr>
           <w:rFonts w:ascii="Consolas" w:hAnsi="Consolas"/>
-          <w:color w:val="8B1A1A"/>
+          <w:color w:val="000000"/>
           <w:sz w:val="19"/>
         </w:rPr>
         <w:t>hf-9d8d210c</w:t>
@@ -288,7 +288,7 @@
       <w:r>
         <w:rPr>
           <w:rFonts w:ascii="Consolas" w:hAnsi="Consolas"/>
-          <w:color w:val="8B1A1A"/>
+          <w:color w:val="000000"/>
           <w:sz w:val="19"/>
         </w:rPr>
         <w:t>git-509ad797</w:t>
@@ -299,7 +299,7 @@
       <w:r>
         <w:rPr>
           <w:rFonts w:ascii="Consolas" w:hAnsi="Consolas"/>
-          <w:color w:val="8B1A1A"/>
+          <w:color w:val="000000"/>
           <w:sz w:val="19"/>
         </w:rPr>
         <w:t>v10-29dcec07</w:t>
@@ -326,7 +326,7 @@
       <w:r>
         <w:rPr>
           <w:rFonts w:ascii="Consolas" w:hAnsi="Consolas"/>
-          <w:color w:val="8B1A1A"/>
+          <w:color w:val="000000"/>
           <w:sz w:val="19"/>
         </w:rPr>
         <w:t>source, source_version, raw_uri, raw_row, raw_sha256, license, source_url, downloaded_at, ingest_run_id</w:t>
@@ -345,7 +345,7 @@
       <w:r>
         <w:rPr>
           <w:rFonts w:ascii="Consolas" w:hAnsi="Consolas"/>
-          <w:color w:val="8B1A1A"/>
+          <w:color w:val="000000"/>
           <w:sz w:val="19"/>
         </w:rPr>
         <w:t>(record_id, source_version)</w:t>
@@ -381,7 +381,7 @@
       <w:r>
         <w:rPr>
           <w:rFonts w:ascii="Consolas" w:hAnsi="Consolas"/>
-          <w:color w:val="8B1A1A"/>
+          <w:color w:val="000000"/>
           <w:sz w:val="19"/>
         </w:rPr>
         <w:t>novel_premises</w:t>
@@ -392,7 +392,7 @@
       <w:r>
         <w:rPr>
           <w:rFonts w:ascii="Consolas" w:hAnsi="Consolas"/>
-          <w:color w:val="8B1A1A"/>
+          <w:color w:val="000000"/>
           <w:sz w:val="19"/>
         </w:rPr>
         <w:t>extra_json</w:t>
@@ -411,7 +411,7 @@
       <w:r>
         <w:rPr>
           <w:rFonts w:ascii="Consolas" w:hAnsi="Consolas"/>
-          <w:color w:val="8B1A1A"/>
+          <w:color w:val="000000"/>
           <w:sz w:val="19"/>
         </w:rPr>
         <w:t>errors</w:t>
@@ -422,7 +422,7 @@
       <w:r>
         <w:rPr>
           <w:rFonts w:ascii="Consolas" w:hAnsi="Consolas"/>
-          <w:color w:val="8B1A1A"/>
+          <w:color w:val="000000"/>
           <w:sz w:val="19"/>
         </w:rPr>
         <w:t>quality_flags</w:t>
@@ -456,7 +456,7 @@
         <w:tc>
           <w:tcPr>
             <w:tcW w:type="dxa" w:w="1949"/>
-            <w:shd w:val="clear" w:color="auto" w:fill="D9E2F3"/>
+            <w:shd w:val="clear" w:color="auto" w:fill="E7E6E6"/>
           </w:tcPr>
           <w:p>
             <w:r>
@@ -476,7 +476,7 @@
         <w:tc>
           <w:tcPr>
             <w:tcW w:type="dxa" w:w="1949"/>
-            <w:shd w:val="clear" w:color="auto" w:fill="D9E2F3"/>
+            <w:shd w:val="clear" w:color="auto" w:fill="E7E6E6"/>
           </w:tcPr>
           <w:p>
             <w:r>
@@ -496,7 +496,7 @@
         <w:tc>
           <w:tcPr>
             <w:tcW w:type="dxa" w:w="1949"/>
-            <w:shd w:val="clear" w:color="auto" w:fill="D9E2F3"/>
+            <w:shd w:val="clear" w:color="auto" w:fill="E7E6E6"/>
           </w:tcPr>
           <w:p>
             <w:r>
@@ -516,7 +516,7 @@
         <w:tc>
           <w:tcPr>
             <w:tcW w:type="dxa" w:w="1949"/>
-            <w:shd w:val="clear" w:color="auto" w:fill="D9E2F3"/>
+            <w:shd w:val="clear" w:color="auto" w:fill="E7E6E6"/>
           </w:tcPr>
           <w:p>
             <w:r>
@@ -536,7 +536,7 @@
         <w:tc>
           <w:tcPr>
             <w:tcW w:type="dxa" w:w="1949"/>
-            <w:shd w:val="clear" w:color="auto" w:fill="D9E2F3"/>
+            <w:shd w:val="clear" w:color="auto" w:fill="E7E6E6"/>
           </w:tcPr>
           <w:p>
             <w:r>
@@ -578,7 +578,7 @@
             <w:r>
               <w:rPr>
                 <w:rFonts w:ascii="Consolas" w:hAnsi="Consolas"/>
-                <w:color w:val="8B1A1A"/>
+                <w:color w:val="000000"/>
                 <w:sz w:val="18"/>
               </w:rPr>
               <w:t>record_id</w:t>
@@ -652,7 +652,7 @@
             <w:r>
               <w:rPr>
                 <w:rFonts w:ascii="Consolas" w:hAnsi="Consolas"/>
-                <w:color w:val="8B1A1A"/>
+                <w:color w:val="000000"/>
                 <w:sz w:val="18"/>
               </w:rPr>
               <w:t>source</w:t>
@@ -726,7 +726,7 @@
             <w:r>
               <w:rPr>
                 <w:rFonts w:ascii="Consolas" w:hAnsi="Consolas"/>
-                <w:color w:val="8B1A1A"/>
+                <w:color w:val="000000"/>
                 <w:sz w:val="18"/>
               </w:rPr>
               <w:t>source_version</w:t>
@@ -800,7 +800,7 @@
             <w:r>
               <w:rPr>
                 <w:rFonts w:ascii="Consolas" w:hAnsi="Consolas"/>
-                <w:color w:val="8B1A1A"/>
+                <w:color w:val="000000"/>
                 <w:sz w:val="18"/>
               </w:rPr>
               <w:t>source_record_key</w:t>
@@ -874,7 +874,7 @@
             <w:r>
               <w:rPr>
                 <w:rFonts w:ascii="Consolas" w:hAnsi="Consolas"/>
-                <w:color w:val="8B1A1A"/>
+                <w:color w:val="000000"/>
                 <w:sz w:val="18"/>
               </w:rPr>
               <w:t>record_type</w:t>
@@ -948,7 +948,7 @@
             <w:r>
               <w:rPr>
                 <w:rFonts w:ascii="Consolas" w:hAnsi="Consolas"/>
-                <w:color w:val="8B1A1A"/>
+                <w:color w:val="000000"/>
                 <w:sz w:val="18"/>
               </w:rPr>
               <w:t>split</w:t>
@@ -1022,7 +1022,7 @@
             <w:r>
               <w:rPr>
                 <w:rFonts w:ascii="Consolas" w:hAnsi="Consolas"/>
-                <w:color w:val="8B1A1A"/>
+                <w:color w:val="000000"/>
                 <w:sz w:val="18"/>
               </w:rPr>
               <w:t>subset</w:t>
@@ -1096,7 +1096,7 @@
             <w:r>
               <w:rPr>
                 <w:rFonts w:ascii="Consolas" w:hAnsi="Consolas"/>
-                <w:color w:val="8B1A1A"/>
+                <w:color w:val="000000"/>
                 <w:sz w:val="18"/>
               </w:rPr>
               <w:t>nl_problem</w:t>
@@ -1170,7 +1170,7 @@
             <w:r>
               <w:rPr>
                 <w:rFonts w:ascii="Consolas" w:hAnsi="Consolas"/>
-                <w:color w:val="8B1A1A"/>
+                <w:color w:val="000000"/>
                 <w:sz w:val="18"/>
               </w:rPr>
               <w:t>nl_solution</w:t>
@@ -1244,7 +1244,7 @@
             <w:r>
               <w:rPr>
                 <w:rFonts w:ascii="Consolas" w:hAnsi="Consolas"/>
-                <w:color w:val="8B1A1A"/>
+                <w:color w:val="000000"/>
                 <w:sz w:val="18"/>
               </w:rPr>
               <w:t>formal_language</w:t>
@@ -1318,7 +1318,7 @@
             <w:r>
               <w:rPr>
                 <w:rFonts w:ascii="Consolas" w:hAnsi="Consolas"/>
-                <w:color w:val="8B1A1A"/>
+                <w:color w:val="000000"/>
                 <w:sz w:val="18"/>
               </w:rPr>
               <w:t>formal_statement</w:t>
@@ -1392,7 +1392,7 @@
             <w:r>
               <w:rPr>
                 <w:rFonts w:ascii="Consolas" w:hAnsi="Consolas"/>
-                <w:color w:val="8B1A1A"/>
+                <w:color w:val="000000"/>
                 <w:sz w:val="18"/>
               </w:rPr>
               <w:t>formal_proof</w:t>
@@ -1466,7 +1466,7 @@
             <w:r>
               <w:rPr>
                 <w:rFonts w:ascii="Consolas" w:hAnsi="Consolas"/>
-                <w:color w:val="8B1A1A"/>
+                <w:color w:val="000000"/>
                 <w:sz w:val="18"/>
               </w:rPr>
               <w:t>formal_header</w:t>
@@ -1540,7 +1540,7 @@
             <w:r>
               <w:rPr>
                 <w:rFonts w:ascii="Consolas" w:hAnsi="Consolas"/>
-                <w:color w:val="8B1A1A"/>
+                <w:color w:val="000000"/>
                 <w:sz w:val="18"/>
               </w:rPr>
               <w:t>formal_goal</w:t>
@@ -1614,7 +1614,7 @@
             <w:r>
               <w:rPr>
                 <w:rFonts w:ascii="Consolas" w:hAnsi="Consolas"/>
-                <w:color w:val="8B1A1A"/>
+                <w:color w:val="000000"/>
                 <w:sz w:val="18"/>
               </w:rPr>
               <w:t>lean_full_name</w:t>
@@ -1688,7 +1688,7 @@
             <w:r>
               <w:rPr>
                 <w:rFonts w:ascii="Consolas" w:hAnsi="Consolas"/>
-                <w:color w:val="8B1A1A"/>
+                <w:color w:val="000000"/>
                 <w:sz w:val="18"/>
               </w:rPr>
               <w:t>lean_file_path</w:t>
@@ -1762,7 +1762,7 @@
             <w:r>
               <w:rPr>
                 <w:rFonts w:ascii="Consolas" w:hAnsi="Consolas"/>
-                <w:color w:val="8B1A1A"/>
+                <w:color w:val="000000"/>
                 <w:sz w:val="18"/>
               </w:rPr>
               <w:t>lean_start_line</w:t>
@@ -1836,7 +1836,7 @@
             <w:r>
               <w:rPr>
                 <w:rFonts w:ascii="Consolas" w:hAnsi="Consolas"/>
-                <w:color w:val="8B1A1A"/>
+                <w:color w:val="000000"/>
                 <w:sz w:val="18"/>
               </w:rPr>
               <w:t>lean_end_line</w:t>
@@ -1910,7 +1910,7 @@
             <w:r>
               <w:rPr>
                 <w:rFonts w:ascii="Consolas" w:hAnsi="Consolas"/>
-                <w:color w:val="8B1A1A"/>
+                <w:color w:val="000000"/>
                 <w:sz w:val="18"/>
               </w:rPr>
               <w:t>tactics</w:t>
@@ -1984,7 +1984,7 @@
             <w:r>
               <w:rPr>
                 <w:rFonts w:ascii="Consolas" w:hAnsi="Consolas"/>
-                <w:color w:val="8B1A1A"/>
+                <w:color w:val="000000"/>
                 <w:sz w:val="18"/>
               </w:rPr>
               <w:t>premises</w:t>
@@ -2058,7 +2058,7 @@
             <w:r>
               <w:rPr>
                 <w:rFonts w:ascii="Consolas" w:hAnsi="Consolas"/>
-                <w:color w:val="8B1A1A"/>
+                <w:color w:val="000000"/>
                 <w:sz w:val="18"/>
               </w:rPr>
               <w:t>num_tactics</w:t>
@@ -2132,7 +2132,7 @@
             <w:r>
               <w:rPr>
                 <w:rFonts w:ascii="Consolas" w:hAnsi="Consolas"/>
-                <w:color w:val="8B1A1A"/>
+                <w:color w:val="000000"/>
                 <w:sz w:val="18"/>
               </w:rPr>
               <w:t>has_text</w:t>
@@ -2206,7 +2206,7 @@
             <w:r>
               <w:rPr>
                 <w:rFonts w:ascii="Consolas" w:hAnsi="Consolas"/>
-                <w:color w:val="8B1A1A"/>
+                <w:color w:val="000000"/>
                 <w:sz w:val="18"/>
               </w:rPr>
               <w:t>has_latex</w:t>
@@ -2280,7 +2280,7 @@
             <w:r>
               <w:rPr>
                 <w:rFonts w:ascii="Consolas" w:hAnsi="Consolas"/>
-                <w:color w:val="8B1A1A"/>
+                <w:color w:val="000000"/>
                 <w:sz w:val="18"/>
               </w:rPr>
               <w:t>has_lean</w:t>
@@ -2354,7 +2354,7 @@
             <w:r>
               <w:rPr>
                 <w:rFonts w:ascii="Consolas" w:hAnsi="Consolas"/>
-                <w:color w:val="8B1A1A"/>
+                <w:color w:val="000000"/>
                 <w:sz w:val="18"/>
               </w:rPr>
               <w:t>latex_count</w:t>
@@ -2428,7 +2428,7 @@
             <w:r>
               <w:rPr>
                 <w:rFonts w:ascii="Consolas" w:hAnsi="Consolas"/>
-                <w:color w:val="8B1A1A"/>
+                <w:color w:val="000000"/>
                 <w:sz w:val="18"/>
               </w:rPr>
               <w:t>content_sha256</w:t>
@@ -2502,7 +2502,7 @@
             <w:r>
               <w:rPr>
                 <w:rFonts w:ascii="Consolas" w:hAnsi="Consolas"/>
-                <w:color w:val="8B1A1A"/>
+                <w:color w:val="000000"/>
                 <w:sz w:val="18"/>
               </w:rPr>
               <w:t>quality_flags</w:t>
@@ -2576,7 +2576,7 @@
             <w:r>
               <w:rPr>
                 <w:rFonts w:ascii="Consolas" w:hAnsi="Consolas"/>
-                <w:color w:val="8B1A1A"/>
+                <w:color w:val="000000"/>
                 <w:sz w:val="18"/>
               </w:rPr>
               <w:t>extra_json</w:t>
@@ -2650,7 +2650,7 @@
             <w:r>
               <w:rPr>
                 <w:rFonts w:ascii="Consolas" w:hAnsi="Consolas"/>
-                <w:color w:val="8B1A1A"/>
+                <w:color w:val="000000"/>
                 <w:sz w:val="18"/>
               </w:rPr>
               <w:t>raw_uri</w:t>
@@ -2724,7 +2724,7 @@
             <w:r>
               <w:rPr>
                 <w:rFonts w:ascii="Consolas" w:hAnsi="Consolas"/>
-                <w:color w:val="8B1A1A"/>
+                <w:color w:val="000000"/>
                 <w:sz w:val="18"/>
               </w:rPr>
               <w:t>raw_row</w:t>
@@ -2798,7 +2798,7 @@
             <w:r>
               <w:rPr>
                 <w:rFonts w:ascii="Consolas" w:hAnsi="Consolas"/>
-                <w:color w:val="8B1A1A"/>
+                <w:color w:val="000000"/>
                 <w:sz w:val="18"/>
               </w:rPr>
               <w:t>raw_sha256</w:t>
@@ -2872,7 +2872,7 @@
             <w:r>
               <w:rPr>
                 <w:rFonts w:ascii="Consolas" w:hAnsi="Consolas"/>
-                <w:color w:val="8B1A1A"/>
+                <w:color w:val="000000"/>
                 <w:sz w:val="18"/>
               </w:rPr>
               <w:t>license</w:t>
@@ -2946,7 +2946,7 @@
             <w:r>
               <w:rPr>
                 <w:rFonts w:ascii="Consolas" w:hAnsi="Consolas"/>
-                <w:color w:val="8B1A1A"/>
+                <w:color w:val="000000"/>
                 <w:sz w:val="18"/>
               </w:rPr>
               <w:t>source_url</w:t>
@@ -3020,7 +3020,7 @@
             <w:r>
               <w:rPr>
                 <w:rFonts w:ascii="Consolas" w:hAnsi="Consolas"/>
-                <w:color w:val="8B1A1A"/>
+                <w:color w:val="000000"/>
                 <w:sz w:val="18"/>
               </w:rPr>
               <w:t>downloaded_at</w:t>
@@ -3094,7 +3094,7 @@
             <w:r>
               <w:rPr>
                 <w:rFonts w:ascii="Consolas" w:hAnsi="Consolas"/>
-                <w:color w:val="8B1A1A"/>
+                <w:color w:val="000000"/>
                 <w:sz w:val="18"/>
               </w:rPr>
               <w:t>ingest_run_id</w:t>
@@ -3168,7 +3168,7 @@
             <w:r>
               <w:rPr>
                 <w:rFonts w:ascii="Consolas" w:hAnsi="Consolas"/>
-                <w:color w:val="8B1A1A"/>
+                <w:color w:val="000000"/>
                 <w:sz w:val="18"/>
               </w:rPr>
               <w:t>pipeline_version</w:t>
@@ -3242,7 +3242,7 @@
             <w:r>
               <w:rPr>
                 <w:rFonts w:ascii="Consolas" w:hAnsi="Consolas"/>
-                <w:color w:val="8B1A1A"/>
+                <w:color w:val="000000"/>
                 <w:sz w:val="18"/>
               </w:rPr>
               <w:t>schema_version</w:t>
@@ -3317,7 +3317,7 @@
         <w:tc>
           <w:tcPr>
             <w:tcW w:type="dxa" w:w="3249"/>
-            <w:shd w:val="clear" w:color="auto" w:fill="D9E2F3"/>
+            <w:shd w:val="clear" w:color="auto" w:fill="E7E6E6"/>
           </w:tcPr>
           <w:p>
             <w:r>
@@ -3337,7 +3337,7 @@
         <w:tc>
           <w:tcPr>
             <w:tcW w:type="dxa" w:w="3249"/>
-            <w:shd w:val="clear" w:color="auto" w:fill="D9E2F3"/>
+            <w:shd w:val="clear" w:color="auto" w:fill="E7E6E6"/>
           </w:tcPr>
           <w:p>
             <w:r>
@@ -3357,7 +3357,7 @@
         <w:tc>
           <w:tcPr>
             <w:tcW w:type="dxa" w:w="3249"/>
-            <w:shd w:val="clear" w:color="auto" w:fill="D9E2F3"/>
+            <w:shd w:val="clear" w:color="auto" w:fill="E7E6E6"/>
           </w:tcPr>
           <w:p>
             <w:r>
@@ -3507,7 +3507,7 @@
             <w:r>
               <w:rPr>
                 <w:rFonts w:ascii="Consolas" w:hAnsi="Consolas"/>
-                <w:color w:val="8B1A1A"/>
+                <w:color w:val="000000"/>
                 <w:sz w:val="20"/>
               </w:rPr>
               <w:t>record_type</w:t>
@@ -3647,7 +3647,7 @@
             <w:r>
               <w:rPr>
                 <w:rFonts w:ascii="Consolas" w:hAnsi="Consolas"/>
-                <w:color w:val="8B1A1A"/>
+                <w:color w:val="000000"/>
                 <w:sz w:val="20"/>
               </w:rPr>
               <w:t>source_version</w:t>
@@ -3881,7 +3881,7 @@
             <w:r>
               <w:rPr>
                 <w:rFonts w:ascii="Consolas" w:hAnsi="Consolas"/>
-                <w:color w:val="8B1A1A"/>
+                <w:color w:val="000000"/>
                 <w:sz w:val="20"/>
               </w:rPr>
               <w:t>$</w:t>
@@ -3963,7 +3963,7 @@
         <w:tc>
           <w:tcPr>
             <w:tcW w:type="dxa" w:w="4873"/>
-            <w:shd w:val="clear" w:color="auto" w:fill="D9E2F3"/>
+            <w:shd w:val="clear" w:color="auto" w:fill="E7E6E6"/>
           </w:tcPr>
           <w:p>
             <w:r>
@@ -3983,7 +3983,7 @@
         <w:tc>
           <w:tcPr>
             <w:tcW w:type="dxa" w:w="4873"/>
-            <w:shd w:val="clear" w:color="auto" w:fill="D9E2F3"/>
+            <w:shd w:val="clear" w:color="auto" w:fill="E7E6E6"/>
           </w:tcPr>
           <w:p>
             <w:r>
@@ -4207,7 +4207,7 @@
       <w:r>
         <w:rPr>
           <w:rFonts w:ascii="Consolas" w:hAnsi="Consolas"/>
-          <w:color w:val="8B1A1A"/>
+          <w:color w:val="000000"/>
           <w:sz w:val="19"/>
         </w:rPr>
         <w:t>schema_version</w:t>
@@ -4246,7 +4246,7 @@
       <w:r>
         <w:rPr>
           <w:rFonts w:ascii="Consolas" w:hAnsi="Consolas"/>
-          <w:color w:val="8B1A1A"/>
+          <w:color w:val="000000"/>
           <w:sz w:val="19"/>
         </w:rPr>
         <w:t>source_version</w:t>
@@ -4652,6 +4652,7 @@
     <w:rsid w:val="00FC693F"/>
     <w:rPr>
       <w:rFonts w:ascii="Times New Roman" w:hAnsi="Times New Roman" w:eastAsia="Times New Roman"/>
+      <w:color w:val="000000"/>
       <w:sz w:val="24"/>
     </w:rPr>
   </w:style>
@@ -4717,7 +4718,7 @@
       <w:rFonts w:ascii="Times New Roman" w:hAnsi="Times New Roman" w:eastAsia="Times New Roman" w:cs="Times New Roman"/>
       <w:b/>
       <w:bCs/>
-      <w:color w:val="1F3A68"/>
+      <w:color w:val="000000"/>
       <w:sz w:val="28"/>
       <w:szCs w:val="28"/>
     </w:rPr>
@@ -4741,7 +4742,7 @@
       <w:rFonts w:ascii="Times New Roman" w:hAnsi="Times New Roman" w:eastAsia="Times New Roman" w:cs="Times New Roman"/>
       <w:b/>
       <w:bCs/>
-      <w:color w:val="1F3A68"/>
+      <w:color w:val="000000"/>
       <w:sz w:val="26"/>
       <w:szCs w:val="26"/>
     </w:rPr>
@@ -4765,7 +4766,7 @@
       <w:rFonts w:ascii="Times New Roman" w:hAnsi="Times New Roman" w:eastAsia="Times New Roman" w:cs="Times New Roman"/>
       <w:b/>
       <w:bCs/>
-      <w:color w:val="1F3A68"/>
+      <w:color w:val="000000"/>
     </w:rPr>
   </w:style>
   <w:style w:type="paragraph" w:styleId="Heading4">
@@ -4790,7 +4791,7 @@
       <w:bCs/>
       <w:i/>
       <w:iCs/>
-      <w:color w:val="1F3A68"/>
+      <w:color w:val="000000"/>
     </w:rPr>
   </w:style>
   <w:style w:type="paragraph" w:styleId="Heading5">
@@ -4811,7 +4812,7 @@
     </w:pPr>
     <w:rPr>
       <w:rFonts w:asciiTheme="majorHAnsi" w:eastAsiaTheme="majorEastAsia" w:hAnsiTheme="majorHAnsi" w:cstheme="majorBidi"/>
-      <w:color w:val="243F60" w:themeColor="accent1" w:themeShade="7F"/>
+      <w:color w:val="000000"/>
     </w:rPr>
   </w:style>
   <w:style w:type="paragraph" w:styleId="Heading6">
@@ -4834,7 +4835,7 @@
       <w:rFonts w:asciiTheme="majorHAnsi" w:eastAsiaTheme="majorEastAsia" w:hAnsiTheme="majorHAnsi" w:cstheme="majorBidi"/>
       <w:i/>
       <w:iCs/>
-      <w:color w:val="243F60" w:themeColor="accent1" w:themeShade="7F"/>
+      <w:color w:val="000000"/>
     </w:rPr>
   </w:style>
   <w:style w:type="paragraph" w:styleId="Heading7">
@@ -4857,7 +4858,7 @@
       <w:rFonts w:asciiTheme="majorHAnsi" w:eastAsiaTheme="majorEastAsia" w:hAnsiTheme="majorHAnsi" w:cstheme="majorBidi"/>
       <w:i/>
       <w:iCs/>
-      <w:color w:val="404040" w:themeColor="text1" w:themeTint="BF"/>
+      <w:color w:val="000000"/>
     </w:rPr>
   </w:style>
   <w:style w:type="paragraph" w:styleId="Heading8">
@@ -4878,7 +4879,7 @@
     </w:pPr>
     <w:rPr>
       <w:rFonts w:asciiTheme="majorHAnsi" w:eastAsiaTheme="majorEastAsia" w:hAnsiTheme="majorHAnsi" w:cstheme="majorBidi"/>
-      <w:color w:val="4F81BD" w:themeColor="accent1"/>
+      <w:color w:val="000000"/>
       <w:sz w:val="20"/>
       <w:szCs w:val="20"/>
     </w:rPr>
@@ -4903,7 +4904,7 @@
       <w:rFonts w:asciiTheme="majorHAnsi" w:eastAsiaTheme="majorEastAsia" w:hAnsiTheme="majorHAnsi" w:cstheme="majorBidi"/>
       <w:i/>
       <w:iCs/>
-      <w:color w:val="404040" w:themeColor="text1" w:themeTint="BF"/>
+      <w:color w:val="000000"/>
       <w:sz w:val="20"/>
       <w:szCs w:val="20"/>
     </w:rPr>
@@ -4954,7 +4955,7 @@
       <w:rFonts w:asciiTheme="majorHAnsi" w:eastAsiaTheme="majorEastAsia" w:hAnsiTheme="majorHAnsi" w:cstheme="majorBidi"/>
       <w:b/>
       <w:bCs/>
-      <w:color w:val="365F91" w:themeColor="accent1" w:themeShade="BF"/>
+      <w:color w:val="000000"/>
       <w:sz w:val="28"/>
       <w:szCs w:val="28"/>
     </w:rPr>
@@ -4969,7 +4970,7 @@
       <w:rFonts w:asciiTheme="majorHAnsi" w:eastAsiaTheme="majorEastAsia" w:hAnsiTheme="majorHAnsi" w:cstheme="majorBidi"/>
       <w:b/>
       <w:bCs/>
-      <w:color w:val="4F81BD" w:themeColor="accent1"/>
+      <w:color w:val="000000"/>
       <w:sz w:val="26"/>
       <w:szCs w:val="26"/>
     </w:rPr>
@@ -4984,7 +4985,7 @@
       <w:rFonts w:asciiTheme="majorHAnsi" w:eastAsiaTheme="majorEastAsia" w:hAnsiTheme="majorHAnsi" w:cstheme="majorBidi"/>
       <w:b/>
       <w:bCs/>
-      <w:color w:val="4F81BD" w:themeColor="accent1"/>
+      <w:color w:val="000000"/>
     </w:rPr>
   </w:style>
   <w:style w:type="paragraph" w:styleId="Title">
@@ -5004,7 +5005,7 @@
     </w:pPr>
     <w:rPr>
       <w:rFonts w:ascii="Times New Roman" w:hAnsi="Times New Roman" w:eastAsia="Times New Roman" w:cs="Times New Roman"/>
-      <w:color w:val="1F3A68"/>
+      <w:color w:val="000000"/>
       <w:spacing w:val="5"/>
       <w:kern w:val="28"/>
       <w:sz w:val="52"/>
@@ -5019,7 +5020,7 @@
     <w:rsid w:val="00FC693F"/>
     <w:rPr>
       <w:rFonts w:asciiTheme="majorHAnsi" w:eastAsiaTheme="majorEastAsia" w:hAnsiTheme="majorHAnsi" w:cstheme="majorBidi"/>
-      <w:color w:val="17365D" w:themeColor="text2" w:themeShade="BF"/>
+      <w:color w:val="000000"/>
       <w:spacing w:val="5"/>
       <w:kern w:val="28"/>
       <w:sz w:val="52"/>
@@ -5043,7 +5044,7 @@
       <w:rFonts w:asciiTheme="majorHAnsi" w:eastAsiaTheme="majorEastAsia" w:hAnsiTheme="majorHAnsi" w:cstheme="majorBidi"/>
       <w:i/>
       <w:iCs/>
-      <w:color w:val="4F81BD" w:themeColor="accent1"/>
+      <w:color w:val="000000"/>
       <w:spacing w:val="15"/>
       <w:sz w:val="24"/>
       <w:szCs w:val="24"/>
@@ -5059,7 +5060,7 @@
       <w:rFonts w:asciiTheme="majorHAnsi" w:eastAsiaTheme="majorEastAsia" w:hAnsiTheme="majorHAnsi" w:cstheme="majorBidi"/>
       <w:i/>
       <w:iCs/>
-      <w:color w:val="4F81BD" w:themeColor="accent1"/>
+      <w:color w:val="000000"/>
       <w:spacing w:val="15"/>
       <w:sz w:val="24"/>
       <w:szCs w:val="24"/>
@@ -5331,7 +5332,7 @@
     <w:rPr>
       <w:i/>
       <w:iCs/>
-      <w:color w:val="000000" w:themeColor="text1"/>
+      <w:color w:val="000000"/>
     </w:rPr>
   </w:style>
   <w:style w:type="character" w:customStyle="1" w:styleId="QuoteChar">
@@ -5343,7 +5344,7 @@
     <w:rPr>
       <w:i/>
       <w:iCs/>
-      <w:color w:val="000000" w:themeColor="text1"/>
+      <w:color w:val="000000"/>
     </w:rPr>
   </w:style>
   <w:style w:type="character" w:customStyle="1" w:styleId="Heading4Char">
@@ -5359,7 +5360,7 @@
       <w:bCs/>
       <w:i/>
       <w:iCs/>
-      <w:color w:val="4F81BD" w:themeColor="accent1"/>
+      <w:color w:val="000000"/>
     </w:rPr>
   </w:style>
   <w:style w:type="character" w:customStyle="1" w:styleId="Heading5Char">
@@ -5371,7 +5372,7 @@
     <w:rsid w:val="00FC693F"/>
     <w:rPr>
       <w:rFonts w:asciiTheme="majorHAnsi" w:eastAsiaTheme="majorEastAsia" w:hAnsiTheme="majorHAnsi" w:cstheme="majorBidi"/>
-      <w:color w:val="243F60" w:themeColor="accent1" w:themeShade="7F"/>
+      <w:color w:val="000000"/>
     </w:rPr>
   </w:style>
   <w:style w:type="character" w:customStyle="1" w:styleId="Heading6Char">
@@ -5385,7 +5386,7 @@
       <w:rFonts w:asciiTheme="majorHAnsi" w:eastAsiaTheme="majorEastAsia" w:hAnsiTheme="majorHAnsi" w:cstheme="majorBidi"/>
       <w:i/>
       <w:iCs/>
-      <w:color w:val="243F60" w:themeColor="accent1" w:themeShade="7F"/>
+      <w:color w:val="000000"/>
     </w:rPr>
   </w:style>
   <w:style w:type="character" w:customStyle="1" w:styleId="Heading7Char">
@@ -5399,7 +5400,7 @@
       <w:rFonts w:asciiTheme="majorHAnsi" w:eastAsiaTheme="majorEastAsia" w:hAnsiTheme="majorHAnsi" w:cstheme="majorBidi"/>
       <w:i/>
       <w:iCs/>
-      <w:color w:val="404040" w:themeColor="text1" w:themeTint="BF"/>
+      <w:color w:val="000000"/>
     </w:rPr>
   </w:style>
   <w:style w:type="character" w:customStyle="1" w:styleId="Heading8Char">
@@ -5411,7 +5412,7 @@
     <w:rsid w:val="00FC693F"/>
     <w:rPr>
       <w:rFonts w:asciiTheme="majorHAnsi" w:eastAsiaTheme="majorEastAsia" w:hAnsiTheme="majorHAnsi" w:cstheme="majorBidi"/>
-      <w:color w:val="4F81BD" w:themeColor="accent1"/>
+      <w:color w:val="000000"/>
       <w:sz w:val="20"/>
       <w:szCs w:val="20"/>
     </w:rPr>
@@ -5427,7 +5428,7 @@
       <w:rFonts w:asciiTheme="majorHAnsi" w:eastAsiaTheme="majorEastAsia" w:hAnsiTheme="majorHAnsi" w:cstheme="majorBidi"/>
       <w:i/>
       <w:iCs/>
-      <w:color w:val="404040" w:themeColor="text1" w:themeTint="BF"/>
+      <w:color w:val="000000"/>
       <w:sz w:val="20"/>
       <w:szCs w:val="20"/>
     </w:rPr>
@@ -5447,7 +5448,7 @@
     <w:rPr>
       <w:b/>
       <w:bCs/>
-      <w:color w:val="4F81BD" w:themeColor="accent1"/>
+      <w:color w:val="000000"/>
       <w:sz w:val="18"/>
       <w:szCs w:val="18"/>
     </w:rPr>
@@ -5494,7 +5495,7 @@
       <w:bCs/>
       <w:i/>
       <w:iCs/>
-      <w:color w:val="4F81BD" w:themeColor="accent1"/>
+      <w:color w:val="000000"/>
     </w:rPr>
   </w:style>
   <w:style w:type="character" w:customStyle="1" w:styleId="IntenseQuoteChar">
@@ -5508,7 +5509,7 @@
       <w:bCs/>
       <w:i/>
       <w:iCs/>
-      <w:color w:val="4F81BD" w:themeColor="accent1"/>
+      <w:color w:val="000000"/>
     </w:rPr>
   </w:style>
   <w:style w:type="character" w:styleId="SubtleEmphasis">
@@ -5520,7 +5521,7 @@
     <w:rPr>
       <w:i/>
       <w:iCs/>
-      <w:color w:val="808080" w:themeColor="text1" w:themeTint="7F"/>
+      <w:color w:val="000000"/>
     </w:rPr>
   </w:style>
   <w:style w:type="character" w:styleId="IntenseEmphasis">
@@ -5534,7 +5535,7 @@
       <w:bCs/>
       <w:i/>
       <w:iCs/>
-      <w:color w:val="4F81BD" w:themeColor="accent1"/>
+      <w:color w:val="000000"/>
     </w:rPr>
   </w:style>
   <w:style w:type="character" w:styleId="SubtleReference">
@@ -5545,7 +5546,7 @@
     <w:rsid w:val="00FC693F"/>
     <w:rPr>
       <w:smallCaps/>
-      <w:color w:val="C0504D" w:themeColor="accent2"/>
+      <w:color w:val="000000"/>
       <w:u w:val="single"/>
     </w:rPr>
   </w:style>
@@ -5559,7 +5560,7 @@
       <w:b/>
       <w:bCs/>
       <w:smallCaps/>
-      <w:color w:val="C0504D" w:themeColor="accent2"/>
+      <w:color w:val="000000"/>
       <w:spacing w:val="5"/>
       <w:u w:val="single"/>
     </w:rPr>
@@ -5625,7 +5626,7 @@
       <w:spacing w:after="0" w:line="240" w:lineRule="auto"/>
     </w:pPr>
     <w:rPr>
-      <w:color w:val="000000" w:themeColor="text1" w:themeShade="BF"/>
+      <w:color w:val="000000"/>
     </w:rPr>
     <w:tblPr>
       <w:tblStyleRowBandSize w:val="1"/>
@@ -5728,7 +5729,7 @@
       <w:spacing w:after="0" w:line="240" w:lineRule="auto"/>
     </w:pPr>
     <w:rPr>
-      <w:color w:val="365F91" w:themeColor="accent1" w:themeShade="BF"/>
+      <w:color w:val="000000"/>
     </w:rPr>
     <w:tblPr>
       <w:tblStyleRowBandSize w:val="1"/>
@@ -5831,7 +5832,7 @@
       <w:spacing w:after="0" w:line="240" w:lineRule="auto"/>
     </w:pPr>
     <w:rPr>
-      <w:color w:val="943634" w:themeColor="accent2" w:themeShade="BF"/>
+      <w:color w:val="000000"/>
     </w:rPr>
     <w:tblPr>
       <w:tblStyleRowBandSize w:val="1"/>
@@ -5934,7 +5935,7 @@
       <w:spacing w:after="0" w:line="240" w:lineRule="auto"/>
     </w:pPr>
     <w:rPr>
-      <w:color w:val="76923C" w:themeColor="accent3" w:themeShade="BF"/>
+      <w:color w:val="000000"/>
     </w:rPr>
     <w:tblPr>
       <w:tblStyleRowBandSize w:val="1"/>
@@ -6037,7 +6038,7 @@
       <w:spacing w:after="0" w:line="240" w:lineRule="auto"/>
     </w:pPr>
     <w:rPr>
-      <w:color w:val="5F497A" w:themeColor="accent4" w:themeShade="BF"/>
+      <w:color w:val="000000"/>
     </w:rPr>
     <w:tblPr>
       <w:tblStyleRowBandSize w:val="1"/>
@@ -6140,7 +6141,7 @@
       <w:spacing w:after="0" w:line="240" w:lineRule="auto"/>
     </w:pPr>
     <w:rPr>
-      <w:color w:val="31849B" w:themeColor="accent5" w:themeShade="BF"/>
+      <w:color w:val="000000"/>
     </w:rPr>
     <w:tblPr>
       <w:tblStyleRowBandSize w:val="1"/>
@@ -6243,7 +6244,7 @@
       <w:spacing w:after="0" w:line="240" w:lineRule="auto"/>
     </w:pPr>
     <w:rPr>
-      <w:color w:val="E36C0A" w:themeColor="accent6" w:themeShade="BF"/>
+      <w:color w:val="000000"/>
     </w:rPr>
     <w:tblPr>
       <w:tblStyleRowBandSize w:val="1"/>
@@ -6369,7 +6370,7 @@
       <w:rPr>
         <w:b/>
         <w:bCs/>
-        <w:color w:val="FFFFFF" w:themeColor="background1"/>
+        <w:color w:val="000000"/>
       </w:rPr>
       <w:tblPr/>
       <w:tcPr>
@@ -6461,7 +6462,7 @@
       <w:rPr>
         <w:b/>
         <w:bCs/>
-        <w:color w:val="FFFFFF" w:themeColor="background1"/>
+        <w:color w:val="000000"/>
       </w:rPr>
       <w:tblPr/>
       <w:tcPr>
@@ -6553,7 +6554,7 @@
       <w:rPr>
         <w:b/>
         <w:bCs/>
-        <w:color w:val="FFFFFF" w:themeColor="background1"/>
+        <w:color w:val="000000"/>
       </w:rPr>
       <w:tblPr/>
       <w:tcPr>
@@ -6645,7 +6646,7 @@
       <w:rPr>
         <w:b/>
         <w:bCs/>
-        <w:color w:val="FFFFFF" w:themeColor="background1"/>
+        <w:color w:val="000000"/>
       </w:rPr>
       <w:tblPr/>
       <w:tcPr>
@@ -6737,7 +6738,7 @@
       <w:rPr>
         <w:b/>
         <w:bCs/>
-        <w:color w:val="FFFFFF" w:themeColor="background1"/>
+        <w:color w:val="000000"/>
       </w:rPr>
       <w:tblPr/>
       <w:tcPr>
@@ -6829,7 +6830,7 @@
       <w:rPr>
         <w:b/>
         <w:bCs/>
-        <w:color w:val="FFFFFF" w:themeColor="background1"/>
+        <w:color w:val="000000"/>
       </w:rPr>
       <w:tblPr/>
       <w:tcPr>
@@ -6921,7 +6922,7 @@
       <w:rPr>
         <w:b/>
         <w:bCs/>
-        <w:color w:val="FFFFFF" w:themeColor="background1"/>
+        <w:color w:val="000000"/>
       </w:rPr>
       <w:tblPr/>
       <w:tcPr>
@@ -7924,7 +7925,7 @@
       <w:rPr>
         <w:b/>
         <w:bCs/>
-        <w:color w:val="FFFFFF" w:themeColor="background1"/>
+        <w:color w:val="000000"/>
       </w:rPr>
       <w:tblPr/>
       <w:tcPr>
@@ -8030,7 +8031,7 @@
       <w:rPr>
         <w:b/>
         <w:bCs/>
-        <w:color w:val="FFFFFF" w:themeColor="background1"/>
+        <w:color w:val="000000"/>
       </w:rPr>
       <w:tblPr/>
       <w:tcPr>
@@ -8136,7 +8137,7 @@
       <w:rPr>
         <w:b/>
         <w:bCs/>
-        <w:color w:val="FFFFFF" w:themeColor="background1"/>
+        <w:color w:val="000000"/>
       </w:rPr>
       <w:tblPr/>
       <w:tcPr>
@@ -8242,7 +8243,7 @@
       <w:rPr>
         <w:b/>
         <w:bCs/>
-        <w:color w:val="FFFFFF" w:themeColor="background1"/>
+        <w:color w:val="000000"/>
       </w:rPr>
       <w:tblPr/>
       <w:tcPr>
@@ -8348,7 +8349,7 @@
       <w:rPr>
         <w:b/>
         <w:bCs/>
-        <w:color w:val="FFFFFF" w:themeColor="background1"/>
+        <w:color w:val="000000"/>
       </w:rPr>
       <w:tblPr/>
       <w:tcPr>
@@ -8454,7 +8455,7 @@
       <w:rPr>
         <w:b/>
         <w:bCs/>
-        <w:color w:val="FFFFFF" w:themeColor="background1"/>
+        <w:color w:val="000000"/>
       </w:rPr>
       <w:tblPr/>
       <w:tcPr>
@@ -8560,7 +8561,7 @@
       <w:rPr>
         <w:b/>
         <w:bCs/>
-        <w:color w:val="FFFFFF" w:themeColor="background1"/>
+        <w:color w:val="000000"/>
       </w:rPr>
       <w:tblPr/>
       <w:tcPr>
@@ -8663,7 +8664,7 @@
       <w:rPr>
         <w:b/>
         <w:bCs/>
-        <w:color w:val="FFFFFF" w:themeColor="background1"/>
+        <w:color w:val="000000"/>
       </w:rPr>
       <w:tblPr/>
       <w:tcPr>
@@ -8683,7 +8684,7 @@
         <w:spacing w:before="0" w:after="0" w:line="240" w:lineRule="auto"/>
       </w:pPr>
       <w:rPr>
-        <w:color w:val="auto"/>
+        <w:color w:val="000000"/>
       </w:rPr>
       <w:tblPr/>
       <w:tcPr>
@@ -8702,7 +8703,7 @@
       <w:rPr>
         <w:b/>
         <w:bCs/>
-        <w:color w:val="FFFFFF" w:themeColor="background1"/>
+        <w:color w:val="000000"/>
       </w:rPr>
       <w:tblPr/>
       <w:tcPr>
@@ -8721,7 +8722,7 @@
       <w:rPr>
         <w:b/>
         <w:bCs/>
-        <w:color w:val="FFFFFF" w:themeColor="background1"/>
+        <w:color w:val="000000"/>
       </w:rPr>
       <w:tblPr/>
       <w:tcPr>
@@ -8767,7 +8768,7 @@
     </w:tblStylePr>
     <w:tblStylePr w:type="nwCell">
       <w:rPr>
-        <w:color w:val="FFFFFF" w:themeColor="background1"/>
+        <w:color w:val="000000"/>
       </w:rPr>
       <w:tblPr/>
       <w:tcPr>
@@ -8812,7 +8813,7 @@
       <w:rPr>
         <w:b/>
         <w:bCs/>
-        <w:color w:val="FFFFFF" w:themeColor="background1"/>
+        <w:color w:val="000000"/>
       </w:rPr>
       <w:tblPr/>
       <w:tcPr>
@@ -8832,7 +8833,7 @@
         <w:spacing w:before="0" w:after="0" w:line="240" w:lineRule="auto"/>
       </w:pPr>
       <w:rPr>
-        <w:color w:val="auto"/>
+        <w:color w:val="000000"/>
       </w:rPr>
       <w:tblPr/>
       <w:tcPr>
@@ -8851,7 +8852,7 @@
       <w:rPr>
         <w:b/>
         <w:bCs/>
-        <w:color w:val="FFFFFF" w:themeColor="background1"/>
+        <w:color w:val="000000"/>
       </w:rPr>
       <w:tblPr/>
       <w:tcPr>
@@ -8870,7 +8871,7 @@
       <w:rPr>
         <w:b/>
         <w:bCs/>
-        <w:color w:val="FFFFFF" w:themeColor="background1"/>
+        <w:color w:val="000000"/>
       </w:rPr>
       <w:tblPr/>
       <w:tcPr>
@@ -8916,7 +8917,7 @@
     </w:tblStylePr>
     <w:tblStylePr w:type="nwCell">
       <w:rPr>
-        <w:color w:val="FFFFFF" w:themeColor="background1"/>
+        <w:color w:val="000000"/>
       </w:rPr>
       <w:tblPr/>
       <w:tcPr>
@@ -8961,7 +8962,7 @@
       <w:rPr>
         <w:b/>
         <w:bCs/>
-        <w:color w:val="FFFFFF" w:themeColor="background1"/>
+        <w:color w:val="000000"/>
       </w:rPr>
       <w:tblPr/>
       <w:tcPr>
@@ -8981,7 +8982,7 @@
         <w:spacing w:before="0" w:after="0" w:line="240" w:lineRule="auto"/>
       </w:pPr>
       <w:rPr>
-        <w:color w:val="auto"/>
+        <w:color w:val="000000"/>
       </w:rPr>
       <w:tblPr/>
       <w:tcPr>
@@ -9000,7 +9001,7 @@
       <w:rPr>
         <w:b/>
         <w:bCs/>
-        <w:color w:val="FFFFFF" w:themeColor="background1"/>
+        <w:color w:val="000000"/>
       </w:rPr>
       <w:tblPr/>
       <w:tcPr>
@@ -9019,7 +9020,7 @@
       <w:rPr>
         <w:b/>
         <w:bCs/>
-        <w:color w:val="FFFFFF" w:themeColor="background1"/>
+        <w:color w:val="000000"/>
       </w:rPr>
       <w:tblPr/>
       <w:tcPr>
@@ -9065,7 +9066,7 @@
     </w:tblStylePr>
     <w:tblStylePr w:type="nwCell">
       <w:rPr>
-        <w:color w:val="FFFFFF" w:themeColor="background1"/>
+        <w:color w:val="000000"/>
       </w:rPr>
       <w:tblPr/>
       <w:tcPr>
@@ -9110,7 +9111,7 @@
       <w:rPr>
         <w:b/>
         <w:bCs/>
-        <w:color w:val="FFFFFF" w:themeColor="background1"/>
+        <w:color w:val="000000"/>
       </w:rPr>
       <w:tblPr/>
       <w:tcPr>
@@ -9130,7 +9131,7 @@
         <w:spacing w:before="0" w:after="0" w:line="240" w:lineRule="auto"/>
       </w:pPr>
       <w:rPr>
-        <w:color w:val="auto"/>
+        <w:color w:val="000000"/>
       </w:rPr>
       <w:tblPr/>
       <w:tcPr>
@@ -9149,7 +9150,7 @@
       <w:rPr>
         <w:b/>
         <w:bCs/>
-        <w:color w:val="FFFFFF" w:themeColor="background1"/>
+        <w:color w:val="000000"/>
       </w:rPr>
       <w:tblPr/>
       <w:tcPr>
@@ -9168,7 +9169,7 @@
       <w:rPr>
         <w:b/>
         <w:bCs/>
-        <w:color w:val="FFFFFF" w:themeColor="background1"/>
+        <w:color w:val="000000"/>
       </w:rPr>
       <w:tblPr/>
       <w:tcPr>
@@ -9214,7 +9215,7 @@
     </w:tblStylePr>
     <w:tblStylePr w:type="nwCell">
       <w:rPr>
-        <w:color w:val="FFFFFF" w:themeColor="background1"/>
+        <w:color w:val="000000"/>
       </w:rPr>
       <w:tblPr/>
       <w:tcPr>
@@ -9259,7 +9260,7 @@
       <w:rPr>
         <w:b/>
         <w:bCs/>
-        <w:color w:val="FFFFFF" w:themeColor="background1"/>
+        <w:color w:val="000000"/>
       </w:rPr>
       <w:tblPr/>
       <w:tcPr>
@@ -9279,7 +9280,7 @@
         <w:spacing w:before="0" w:after="0" w:line="240" w:lineRule="auto"/>
       </w:pPr>
       <w:rPr>
-        <w:color w:val="auto"/>
+        <w:color w:val="000000"/>
       </w:rPr>
       <w:tblPr/>
       <w:tcPr>
@@ -9298,7 +9299,7 @@
       <w:rPr>
         <w:b/>
         <w:bCs/>
-        <w:color w:val="FFFFFF" w:themeColor="background1"/>
+        <w:color w:val="000000"/>
       </w:rPr>
       <w:tblPr/>
       <w:tcPr>
@@ -9317,7 +9318,7 @@
       <w:rPr>
         <w:b/>
         <w:bCs/>
-        <w:color w:val="FFFFFF" w:themeColor="background1"/>
+        <w:color w:val="000000"/>
       </w:rPr>
       <w:tblPr/>
       <w:tcPr>
@@ -9363,7 +9364,7 @@
     </w:tblStylePr>
     <w:tblStylePr w:type="nwCell">
       <w:rPr>
-        <w:color w:val="FFFFFF" w:themeColor="background1"/>
+        <w:color w:val="000000"/>
       </w:rPr>
       <w:tblPr/>
       <w:tcPr>
@@ -9408,7 +9409,7 @@
       <w:rPr>
         <w:b/>
         <w:bCs/>
-        <w:color w:val="FFFFFF" w:themeColor="background1"/>
+        <w:color w:val="000000"/>
       </w:rPr>
       <w:tblPr/>
       <w:tcPr>
@@ -9428,7 +9429,7 @@
         <w:spacing w:before="0" w:after="0" w:line="240" w:lineRule="auto"/>
       </w:pPr>
       <w:rPr>
-        <w:color w:val="auto"/>
+        <w:color w:val="000000"/>
       </w:rPr>
       <w:tblPr/>
       <w:tcPr>
@@ -9447,7 +9448,7 @@
       <w:rPr>
         <w:b/>
         <w:bCs/>
-        <w:color w:val="FFFFFF" w:themeColor="background1"/>
+        <w:color w:val="000000"/>
       </w:rPr>
       <w:tblPr/>
       <w:tcPr>
@@ -9466,7 +9467,7 @@
       <w:rPr>
         <w:b/>
         <w:bCs/>
-        <w:color w:val="FFFFFF" w:themeColor="background1"/>
+        <w:color w:val="000000"/>
       </w:rPr>
       <w:tblPr/>
       <w:tcPr>
@@ -9512,7 +9513,7 @@
     </w:tblStylePr>
     <w:tblStylePr w:type="nwCell">
       <w:rPr>
-        <w:color w:val="FFFFFF" w:themeColor="background1"/>
+        <w:color w:val="000000"/>
       </w:rPr>
       <w:tblPr/>
       <w:tcPr>
@@ -9557,7 +9558,7 @@
       <w:rPr>
         <w:b/>
         <w:bCs/>
-        <w:color w:val="FFFFFF" w:themeColor="background1"/>
+        <w:color w:val="000000"/>
       </w:rPr>
       <w:tblPr/>
       <w:tcPr>
@@ -9577,7 +9578,7 @@
         <w:spacing w:before="0" w:after="0" w:line="240" w:lineRule="auto"/>
       </w:pPr>
       <w:rPr>
-        <w:color w:val="auto"/>
+        <w:color w:val="000000"/>
       </w:rPr>
       <w:tblPr/>
       <w:tcPr>
@@ -9596,7 +9597,7 @@
       <w:rPr>
         <w:b/>
         <w:bCs/>
-        <w:color w:val="FFFFFF" w:themeColor="background1"/>
+        <w:color w:val="000000"/>
       </w:rPr>
       <w:tblPr/>
       <w:tcPr>
@@ -9615,7 +9616,7 @@
       <w:rPr>
         <w:b/>
         <w:bCs/>
-        <w:color w:val="FFFFFF" w:themeColor="background1"/>
+        <w:color w:val="000000"/>
       </w:rPr>
       <w:tblPr/>
       <w:tcPr>
@@ -9661,7 +9662,7 @@
     </w:tblStylePr>
     <w:tblStylePr w:type="nwCell">
       <w:rPr>
-        <w:color w:val="FFFFFF" w:themeColor="background1"/>
+        <w:color w:val="000000"/>
       </w:rPr>
       <w:tblPr/>
       <w:tcPr>
@@ -9685,7 +9686,7 @@
       <w:spacing w:after="0" w:line="240" w:lineRule="auto"/>
     </w:pPr>
     <w:rPr>
-      <w:color w:val="000000" w:themeColor="text1"/>
+      <w:color w:val="000000"/>
     </w:rPr>
     <w:tblPr>
       <w:tblStyleRowBandSize w:val="1"/>
@@ -9718,7 +9719,7 @@
       <w:rPr>
         <w:b/>
         <w:bCs/>
-        <w:color w:val="1F497D" w:themeColor="text2"/>
+        <w:color w:val="000000"/>
       </w:rPr>
       <w:tblPr/>
       <w:tcPr>
@@ -9769,7 +9770,7 @@
       <w:spacing w:after="0" w:line="240" w:lineRule="auto"/>
     </w:pPr>
     <w:rPr>
-      <w:color w:val="000000" w:themeColor="text1"/>
+      <w:color w:val="000000"/>
     </w:rPr>
     <w:tblPr>
       <w:tblStyleRowBandSize w:val="1"/>
@@ -9802,7 +9803,7 @@
       <w:rPr>
         <w:b/>
         <w:bCs/>
-        <w:color w:val="1F497D" w:themeColor="text2"/>
+        <w:color w:val="000000"/>
       </w:rPr>
       <w:tblPr/>
       <w:tcPr>
@@ -9853,7 +9854,7 @@
       <w:spacing w:after="0" w:line="240" w:lineRule="auto"/>
     </w:pPr>
     <w:rPr>
-      <w:color w:val="000000" w:themeColor="text1"/>
+      <w:color w:val="000000"/>
     </w:rPr>
     <w:tblPr>
       <w:tblStyleRowBandSize w:val="1"/>
@@ -9886,7 +9887,7 @@
       <w:rPr>
         <w:b/>
         <w:bCs/>
-        <w:color w:val="1F497D" w:themeColor="text2"/>
+        <w:color w:val="000000"/>
       </w:rPr>
       <w:tblPr/>
       <w:tcPr>
@@ -9937,7 +9938,7 @@
       <w:spacing w:after="0" w:line="240" w:lineRule="auto"/>
     </w:pPr>
     <w:rPr>
-      <w:color w:val="000000" w:themeColor="text1"/>
+      <w:color w:val="000000"/>
     </w:rPr>
     <w:tblPr>
       <w:tblStyleRowBandSize w:val="1"/>
@@ -9970,7 +9971,7 @@
       <w:rPr>
         <w:b/>
         <w:bCs/>
-        <w:color w:val="1F497D" w:themeColor="text2"/>
+        <w:color w:val="000000"/>
       </w:rPr>
       <w:tblPr/>
       <w:tcPr>
@@ -10021,7 +10022,7 @@
       <w:spacing w:after="0" w:line="240" w:lineRule="auto"/>
     </w:pPr>
     <w:rPr>
-      <w:color w:val="000000" w:themeColor="text1"/>
+      <w:color w:val="000000"/>
     </w:rPr>
     <w:tblPr>
       <w:tblStyleRowBandSize w:val="1"/>
@@ -10054,7 +10055,7 @@
       <w:rPr>
         <w:b/>
         <w:bCs/>
-        <w:color w:val="1F497D" w:themeColor="text2"/>
+        <w:color w:val="000000"/>
       </w:rPr>
       <w:tblPr/>
       <w:tcPr>
@@ -10105,7 +10106,7 @@
       <w:spacing w:after="0" w:line="240" w:lineRule="auto"/>
     </w:pPr>
     <w:rPr>
-      <w:color w:val="000000" w:themeColor="text1"/>
+      <w:color w:val="000000"/>
     </w:rPr>
     <w:tblPr>
       <w:tblStyleRowBandSize w:val="1"/>
@@ -10138,7 +10139,7 @@
       <w:rPr>
         <w:b/>
         <w:bCs/>
-        <w:color w:val="1F497D" w:themeColor="text2"/>
+        <w:color w:val="000000"/>
       </w:rPr>
       <w:tblPr/>
       <w:tcPr>
@@ -10189,7 +10190,7 @@
       <w:spacing w:after="0" w:line="240" w:lineRule="auto"/>
     </w:pPr>
     <w:rPr>
-      <w:color w:val="000000" w:themeColor="text1"/>
+      <w:color w:val="000000"/>
     </w:rPr>
     <w:tblPr>
       <w:tblStyleRowBandSize w:val="1"/>
@@ -10222,7 +10223,7 @@
       <w:rPr>
         <w:b/>
         <w:bCs/>
-        <w:color w:val="1F497D" w:themeColor="text2"/>
+        <w:color w:val="000000"/>
       </w:rPr>
       <w:tblPr/>
       <w:tcPr>
@@ -10274,7 +10275,7 @@
     </w:pPr>
     <w:rPr>
       <w:rFonts w:asciiTheme="majorHAnsi" w:eastAsiaTheme="majorEastAsia" w:hAnsiTheme="majorHAnsi" w:cstheme="majorBidi"/>
-      <w:color w:val="000000" w:themeColor="text1"/>
+      <w:color w:val="000000"/>
     </w:rPr>
     <w:tblPr>
       <w:tblStyleRowBandSize w:val="1"/>
@@ -10402,7 +10403,7 @@
     </w:pPr>
     <w:rPr>
       <w:rFonts w:asciiTheme="majorHAnsi" w:eastAsiaTheme="majorEastAsia" w:hAnsiTheme="majorHAnsi" w:cstheme="majorBidi"/>
-      <w:color w:val="000000" w:themeColor="text1"/>
+      <w:color w:val="000000"/>
     </w:rPr>
     <w:tblPr>
       <w:tblStyleRowBandSize w:val="1"/>
@@ -10530,7 +10531,7 @@
     </w:pPr>
     <w:rPr>
       <w:rFonts w:asciiTheme="majorHAnsi" w:eastAsiaTheme="majorEastAsia" w:hAnsiTheme="majorHAnsi" w:cstheme="majorBidi"/>
-      <w:color w:val="000000" w:themeColor="text1"/>
+      <w:color w:val="000000"/>
     </w:rPr>
     <w:tblPr>
       <w:tblStyleRowBandSize w:val="1"/>
@@ -10658,7 +10659,7 @@
     </w:pPr>
     <w:rPr>
       <w:rFonts w:asciiTheme="majorHAnsi" w:eastAsiaTheme="majorEastAsia" w:hAnsiTheme="majorHAnsi" w:cstheme="majorBidi"/>
-      <w:color w:val="000000" w:themeColor="text1"/>
+      <w:color w:val="000000"/>
     </w:rPr>
     <w:tblPr>
       <w:tblStyleRowBandSize w:val="1"/>
@@ -10786,7 +10787,7 @@
     </w:pPr>
     <w:rPr>
       <w:rFonts w:asciiTheme="majorHAnsi" w:eastAsiaTheme="majorEastAsia" w:hAnsiTheme="majorHAnsi" w:cstheme="majorBidi"/>
-      <w:color w:val="000000" w:themeColor="text1"/>
+      <w:color w:val="000000"/>
     </w:rPr>
     <w:tblPr>
       <w:tblStyleRowBandSize w:val="1"/>
@@ -10914,7 +10915,7 @@
     </w:pPr>
     <w:rPr>
       <w:rFonts w:asciiTheme="majorHAnsi" w:eastAsiaTheme="majorEastAsia" w:hAnsiTheme="majorHAnsi" w:cstheme="majorBidi"/>
-      <w:color w:val="000000" w:themeColor="text1"/>
+      <w:color w:val="000000"/>
     </w:rPr>
     <w:tblPr>
       <w:tblStyleRowBandSize w:val="1"/>
@@ -11042,7 +11043,7 @@
     </w:pPr>
     <w:rPr>
       <w:rFonts w:asciiTheme="majorHAnsi" w:eastAsiaTheme="majorEastAsia" w:hAnsiTheme="majorHAnsi" w:cstheme="majorBidi"/>
-      <w:color w:val="000000" w:themeColor="text1"/>
+      <w:color w:val="000000"/>
     </w:rPr>
     <w:tblPr>
       <w:tblStyleRowBandSize w:val="1"/>
@@ -11681,7 +11682,7 @@
     </w:pPr>
     <w:rPr>
       <w:rFonts w:asciiTheme="majorHAnsi" w:eastAsiaTheme="majorEastAsia" w:hAnsiTheme="majorHAnsi" w:cstheme="majorBidi"/>
-      <w:color w:val="000000" w:themeColor="text1"/>
+      <w:color w:val="000000"/>
     </w:rPr>
     <w:tblPr>
       <w:tblStyleRowBandSize w:val="1"/>
@@ -11709,7 +11710,7 @@
       <w:rPr>
         <w:b/>
         <w:bCs/>
-        <w:color w:val="000000" w:themeColor="text1"/>
+        <w:color w:val="000000"/>
       </w:rPr>
       <w:tblPr/>
       <w:tcPr>
@@ -11720,7 +11721,7 @@
       <w:rPr>
         <w:b/>
         <w:bCs/>
-        <w:color w:val="000000" w:themeColor="text1"/>
+        <w:color w:val="000000"/>
       </w:rPr>
       <w:tblPr/>
       <w:tcPr>
@@ -11739,7 +11740,7 @@
       <w:rPr>
         <w:b/>
         <w:bCs/>
-        <w:color w:val="000000" w:themeColor="text1"/>
+        <w:color w:val="000000"/>
       </w:rPr>
       <w:tblPr/>
       <w:tcPr>
@@ -11758,7 +11759,7 @@
       <w:rPr>
         <w:b w:val="0"/>
         <w:bCs w:val="0"/>
-        <w:color w:val="000000" w:themeColor="text1"/>
+        <w:color w:val="000000"/>
       </w:rPr>
       <w:tblPr/>
       <w:tcPr>
@@ -11806,7 +11807,7 @@
     </w:pPr>
     <w:rPr>
       <w:rFonts w:asciiTheme="majorHAnsi" w:eastAsiaTheme="majorEastAsia" w:hAnsiTheme="majorHAnsi" w:cstheme="majorBidi"/>
-      <w:color w:val="000000" w:themeColor="text1"/>
+      <w:color w:val="000000"/>
     </w:rPr>
     <w:tblPr>
       <w:tblStyleRowBandSize w:val="1"/>
@@ -11834,7 +11835,7 @@
       <w:rPr>
         <w:b/>
         <w:bCs/>
-        <w:color w:val="000000" w:themeColor="text1"/>
+        <w:color w:val="000000"/>
       </w:rPr>
       <w:tblPr/>
       <w:tcPr>
@@ -11845,7 +11846,7 @@
       <w:rPr>
         <w:b/>
         <w:bCs/>
-        <w:color w:val="000000" w:themeColor="text1"/>
+        <w:color w:val="000000"/>
       </w:rPr>
       <w:tblPr/>
       <w:tcPr>
@@ -11864,7 +11865,7 @@
       <w:rPr>
         <w:b/>
         <w:bCs/>
-        <w:color w:val="000000" w:themeColor="text1"/>
+        <w:color w:val="000000"/>
       </w:rPr>
       <w:tblPr/>
       <w:tcPr>
@@ -11883,7 +11884,7 @@
       <w:rPr>
         <w:b w:val="0"/>
         <w:bCs w:val="0"/>
-        <w:color w:val="000000" w:themeColor="text1"/>
+        <w:color w:val="000000"/>
       </w:rPr>
       <w:tblPr/>
       <w:tcPr>
@@ -11931,7 +11932,7 @@
     </w:pPr>
     <w:rPr>
       <w:rFonts w:asciiTheme="majorHAnsi" w:eastAsiaTheme="majorEastAsia" w:hAnsiTheme="majorHAnsi" w:cstheme="majorBidi"/>
-      <w:color w:val="000000" w:themeColor="text1"/>
+      <w:color w:val="000000"/>
     </w:rPr>
     <w:tblPr>
       <w:tblStyleRowBandSize w:val="1"/>
@@ -11959,7 +11960,7 @@
       <w:rPr>
         <w:b/>
         <w:bCs/>
-        <w:color w:val="000000" w:themeColor="text1"/>
+        <w:color w:val="000000"/>
       </w:rPr>
       <w:tblPr/>
       <w:tcPr>
@@ -11970,7 +11971,7 @@
       <w:rPr>
         <w:b/>
         <w:bCs/>
-        <w:color w:val="000000" w:themeColor="text1"/>
+        <w:color w:val="000000"/>
       </w:rPr>
       <w:tblPr/>
       <w:tcPr>
@@ -11989,7 +11990,7 @@
       <w:rPr>
         <w:b/>
         <w:bCs/>
-        <w:color w:val="000000" w:themeColor="text1"/>
+        <w:color w:val="000000"/>
       </w:rPr>
       <w:tblPr/>
       <w:tcPr>
@@ -12008,7 +12009,7 @@
       <w:rPr>
         <w:b w:val="0"/>
         <w:bCs w:val="0"/>
-        <w:color w:val="000000" w:themeColor="text1"/>
+        <w:color w:val="000000"/>
       </w:rPr>
       <w:tblPr/>
       <w:tcPr>
@@ -12056,7 +12057,7 @@
     </w:pPr>
     <w:rPr>
       <w:rFonts w:asciiTheme="majorHAnsi" w:eastAsiaTheme="majorEastAsia" w:hAnsiTheme="majorHAnsi" w:cstheme="majorBidi"/>
-      <w:color w:val="000000" w:themeColor="text1"/>
+      <w:color w:val="000000"/>
     </w:rPr>
     <w:tblPr>
       <w:tblStyleRowBandSize w:val="1"/>
@@ -12084,7 +12085,7 @@
       <w:rPr>
         <w:b/>
         <w:bCs/>
-        <w:color w:val="000000" w:themeColor="text1"/>
+        <w:color w:val="000000"/>
       </w:rPr>
       <w:tblPr/>
       <w:tcPr>
@@ -12095,7 +12096,7 @@
       <w:rPr>
         <w:b/>
         <w:bCs/>
-        <w:color w:val="000000" w:themeColor="text1"/>
+        <w:color w:val="000000"/>
       </w:rPr>
       <w:tblPr/>
       <w:tcPr>
@@ -12114,7 +12115,7 @@
       <w:rPr>
         <w:b/>
         <w:bCs/>
-        <w:color w:val="000000" w:themeColor="text1"/>
+        <w:color w:val="000000"/>
       </w:rPr>
       <w:tblPr/>
       <w:tcPr>
@@ -12133,7 +12134,7 @@
       <w:rPr>
         <w:b w:val="0"/>
         <w:bCs w:val="0"/>
-        <w:color w:val="000000" w:themeColor="text1"/>
+        <w:color w:val="000000"/>
       </w:rPr>
       <w:tblPr/>
       <w:tcPr>
@@ -12181,7 +12182,7 @@
     </w:pPr>
     <w:rPr>
       <w:rFonts w:asciiTheme="majorHAnsi" w:eastAsiaTheme="majorEastAsia" w:hAnsiTheme="majorHAnsi" w:cstheme="majorBidi"/>
-      <w:color w:val="000000" w:themeColor="text1"/>
+      <w:color w:val="000000"/>
     </w:rPr>
     <w:tblPr>
       <w:tblStyleRowBandSize w:val="1"/>
@@ -12209,7 +12210,7 @@
       <w:rPr>
         <w:b/>
         <w:bCs/>
-        <w:color w:val="000000" w:themeColor="text1"/>
+        <w:color w:val="000000"/>
       </w:rPr>
       <w:tblPr/>
       <w:tcPr>
@@ -12220,7 +12221,7 @@
       <w:rPr>
         <w:b/>
         <w:bCs/>
-        <w:color w:val="000000" w:themeColor="text1"/>
+        <w:color w:val="000000"/>
       </w:rPr>
       <w:tblPr/>
       <w:tcPr>
@@ -12239,7 +12240,7 @@
       <w:rPr>
         <w:b/>
         <w:bCs/>
-        <w:color w:val="000000" w:themeColor="text1"/>
+        <w:color w:val="000000"/>
       </w:rPr>
       <w:tblPr/>
       <w:tcPr>
@@ -12258,7 +12259,7 @@
       <w:rPr>
         <w:b w:val="0"/>
         <w:bCs w:val="0"/>
-        <w:color w:val="000000" w:themeColor="text1"/>
+        <w:color w:val="000000"/>
       </w:rPr>
       <w:tblPr/>
       <w:tcPr>
@@ -12306,7 +12307,7 @@
     </w:pPr>
     <w:rPr>
       <w:rFonts w:asciiTheme="majorHAnsi" w:eastAsiaTheme="majorEastAsia" w:hAnsiTheme="majorHAnsi" w:cstheme="majorBidi"/>
-      <w:color w:val="000000" w:themeColor="text1"/>
+      <w:color w:val="000000"/>
     </w:rPr>
     <w:tblPr>
       <w:tblStyleRowBandSize w:val="1"/>
@@ -12334,7 +12335,7 @@
       <w:rPr>
         <w:b/>
         <w:bCs/>
-        <w:color w:val="000000" w:themeColor="text1"/>
+        <w:color w:val="000000"/>
       </w:rPr>
       <w:tblPr/>
       <w:tcPr>
@@ -12345,7 +12346,7 @@
       <w:rPr>
         <w:b/>
         <w:bCs/>
-        <w:color w:val="000000" w:themeColor="text1"/>
+        <w:color w:val="000000"/>
       </w:rPr>
       <w:tblPr/>
       <w:tcPr>
@@ -12364,7 +12365,7 @@
       <w:rPr>
         <w:b/>
         <w:bCs/>
-        <w:color w:val="000000" w:themeColor="text1"/>
+        <w:color w:val="000000"/>
       </w:rPr>
       <w:tblPr/>
       <w:tcPr>
@@ -12383,7 +12384,7 @@
       <w:rPr>
         <w:b w:val="0"/>
         <w:bCs w:val="0"/>
-        <w:color w:val="000000" w:themeColor="text1"/>
+        <w:color w:val="000000"/>
       </w:rPr>
       <w:tblPr/>
       <w:tcPr>
@@ -12431,7 +12432,7 @@
     </w:pPr>
     <w:rPr>
       <w:rFonts w:asciiTheme="majorHAnsi" w:eastAsiaTheme="majorEastAsia" w:hAnsiTheme="majorHAnsi" w:cstheme="majorBidi"/>
-      <w:color w:val="000000" w:themeColor="text1"/>
+      <w:color w:val="000000"/>
     </w:rPr>
     <w:tblPr>
       <w:tblStyleRowBandSize w:val="1"/>
@@ -12459,7 +12460,7 @@
       <w:rPr>
         <w:b/>
         <w:bCs/>
-        <w:color w:val="000000" w:themeColor="text1"/>
+        <w:color w:val="000000"/>
       </w:rPr>
       <w:tblPr/>
       <w:tcPr>
@@ -12470,7 +12471,7 @@
       <w:rPr>
         <w:b/>
         <w:bCs/>
-        <w:color w:val="000000" w:themeColor="text1"/>
+        <w:color w:val="000000"/>
       </w:rPr>
       <w:tblPr/>
       <w:tcPr>
@@ -12489,7 +12490,7 @@
       <w:rPr>
         <w:b/>
         <w:bCs/>
-        <w:color w:val="000000" w:themeColor="text1"/>
+        <w:color w:val="000000"/>
       </w:rPr>
       <w:tblPr/>
       <w:tcPr>
@@ -12508,7 +12509,7 @@
       <w:rPr>
         <w:b w:val="0"/>
         <w:bCs w:val="0"/>
-        <w:color w:val="000000" w:themeColor="text1"/>
+        <w:color w:val="000000"/>
       </w:rPr>
       <w:tblPr/>
       <w:tcPr>
@@ -12582,7 +12583,7 @@
         <w:bCs/>
         <w:i w:val="0"/>
         <w:iCs w:val="0"/>
-        <w:color w:val="FFFFFF" w:themeColor="background1"/>
+        <w:color w:val="000000"/>
       </w:rPr>
       <w:tblPr/>
       <w:tcPr>
@@ -12603,7 +12604,7 @@
         <w:bCs/>
         <w:i w:val="0"/>
         <w:iCs w:val="0"/>
-        <w:color w:val="FFFFFF" w:themeColor="background1"/>
+        <w:color w:val="000000"/>
       </w:rPr>
       <w:tblPr/>
       <w:tcPr>
@@ -12624,7 +12625,7 @@
         <w:bCs/>
         <w:i w:val="0"/>
         <w:iCs w:val="0"/>
-        <w:color w:val="FFFFFF" w:themeColor="background1"/>
+        <w:color w:val="000000"/>
       </w:rPr>
       <w:tblPr/>
       <w:tcPr>
@@ -12643,7 +12644,7 @@
         <w:bCs/>
         <w:i w:val="0"/>
         <w:iCs w:val="0"/>
-        <w:color w:val="FFFFFF" w:themeColor="background1"/>
+        <w:color w:val="000000"/>
       </w:rPr>
       <w:tblPr/>
       <w:tcPr>
@@ -12723,7 +12724,7 @@
         <w:bCs/>
         <w:i w:val="0"/>
         <w:iCs w:val="0"/>
-        <w:color w:val="FFFFFF" w:themeColor="background1"/>
+        <w:color w:val="000000"/>
       </w:rPr>
       <w:tblPr/>
       <w:tcPr>
@@ -12744,7 +12745,7 @@
         <w:bCs/>
         <w:i w:val="0"/>
         <w:iCs w:val="0"/>
-        <w:color w:val="FFFFFF" w:themeColor="background1"/>
+        <w:color w:val="000000"/>
       </w:rPr>
       <w:tblPr/>
       <w:tcPr>
@@ -12765,7 +12766,7 @@
         <w:bCs/>
         <w:i w:val="0"/>
         <w:iCs w:val="0"/>
-        <w:color w:val="FFFFFF" w:themeColor="background1"/>
+        <w:color w:val="000000"/>
       </w:rPr>
       <w:tblPr/>
       <w:tcPr>
@@ -12784,7 +12785,7 @@
         <w:bCs/>
         <w:i w:val="0"/>
         <w:iCs w:val="0"/>
-        <w:color w:val="FFFFFF" w:themeColor="background1"/>
+        <w:color w:val="000000"/>
       </w:rPr>
       <w:tblPr/>
       <w:tcPr>
@@ -12864,7 +12865,7 @@
         <w:bCs/>
         <w:i w:val="0"/>
         <w:iCs w:val="0"/>
-        <w:color w:val="FFFFFF" w:themeColor="background1"/>
+        <w:color w:val="000000"/>
       </w:rPr>
       <w:tblPr/>
       <w:tcPr>
@@ -12885,7 +12886,7 @@
         <w:bCs/>
         <w:i w:val="0"/>
         <w:iCs w:val="0"/>
-        <w:color w:val="FFFFFF" w:themeColor="background1"/>
+        <w:color w:val="000000"/>
       </w:rPr>
       <w:tblPr/>
       <w:tcPr>
@@ -12906,7 +12907,7 @@
         <w:bCs/>
         <w:i w:val="0"/>
         <w:iCs w:val="0"/>
-        <w:color w:val="FFFFFF" w:themeColor="background1"/>
+        <w:color w:val="000000"/>
       </w:rPr>
       <w:tblPr/>
       <w:tcPr>
@@ -12925,7 +12926,7 @@
         <w:bCs/>
         <w:i w:val="0"/>
         <w:iCs w:val="0"/>
-        <w:color w:val="FFFFFF" w:themeColor="background1"/>
+        <w:color w:val="000000"/>
       </w:rPr>
       <w:tblPr/>
       <w:tcPr>
@@ -13005,7 +13006,7 @@
         <w:bCs/>
         <w:i w:val="0"/>
         <w:iCs w:val="0"/>
-        <w:color w:val="FFFFFF" w:themeColor="background1"/>
+        <w:color w:val="000000"/>
       </w:rPr>
       <w:tblPr/>
       <w:tcPr>
@@ -13026,7 +13027,7 @@
         <w:bCs/>
         <w:i w:val="0"/>
         <w:iCs w:val="0"/>
-        <w:color w:val="FFFFFF" w:themeColor="background1"/>
+        <w:color w:val="000000"/>
       </w:rPr>
       <w:tblPr/>
       <w:tcPr>
@@ -13047,7 +13048,7 @@
         <w:bCs/>
         <w:i w:val="0"/>
         <w:iCs w:val="0"/>
-        <w:color w:val="FFFFFF" w:themeColor="background1"/>
+        <w:color w:val="000000"/>
       </w:rPr>
       <w:tblPr/>
       <w:tcPr>
@@ -13066,7 +13067,7 @@
         <w:bCs/>
         <w:i w:val="0"/>
         <w:iCs w:val="0"/>
-        <w:color w:val="FFFFFF" w:themeColor="background1"/>
+        <w:color w:val="000000"/>
       </w:rPr>
       <w:tblPr/>
       <w:tcPr>
@@ -13146,7 +13147,7 @@
         <w:bCs/>
         <w:i w:val="0"/>
         <w:iCs w:val="0"/>
-        <w:color w:val="FFFFFF" w:themeColor="background1"/>
+        <w:color w:val="000000"/>
       </w:rPr>
       <w:tblPr/>
       <w:tcPr>
@@ -13167,7 +13168,7 @@
         <w:bCs/>
         <w:i w:val="0"/>
         <w:iCs w:val="0"/>
-        <w:color w:val="FFFFFF" w:themeColor="background1"/>
+        <w:color w:val="000000"/>
       </w:rPr>
       <w:tblPr/>
       <w:tcPr>
@@ -13188,7 +13189,7 @@
         <w:bCs/>
         <w:i w:val="0"/>
         <w:iCs w:val="0"/>
-        <w:color w:val="FFFFFF" w:themeColor="background1"/>
+        <w:color w:val="000000"/>
       </w:rPr>
       <w:tblPr/>
       <w:tcPr>
@@ -13207,7 +13208,7 @@
         <w:bCs/>
         <w:i w:val="0"/>
         <w:iCs w:val="0"/>
-        <w:color w:val="FFFFFF" w:themeColor="background1"/>
+        <w:color w:val="000000"/>
       </w:rPr>
       <w:tblPr/>
       <w:tcPr>
@@ -13287,7 +13288,7 @@
         <w:bCs/>
         <w:i w:val="0"/>
         <w:iCs w:val="0"/>
-        <w:color w:val="FFFFFF" w:themeColor="background1"/>
+        <w:color w:val="000000"/>
       </w:rPr>
       <w:tblPr/>
       <w:tcPr>
@@ -13308,7 +13309,7 @@
         <w:bCs/>
         <w:i w:val="0"/>
         <w:iCs w:val="0"/>
-        <w:color w:val="FFFFFF" w:themeColor="background1"/>
+        <w:color w:val="000000"/>
       </w:rPr>
       <w:tblPr/>
       <w:tcPr>
@@ -13329,7 +13330,7 @@
         <w:bCs/>
         <w:i w:val="0"/>
         <w:iCs w:val="0"/>
-        <w:color w:val="FFFFFF" w:themeColor="background1"/>
+        <w:color w:val="000000"/>
       </w:rPr>
       <w:tblPr/>
       <w:tcPr>
@@ -13348,7 +13349,7 @@
         <w:bCs/>
         <w:i w:val="0"/>
         <w:iCs w:val="0"/>
-        <w:color w:val="FFFFFF" w:themeColor="background1"/>
+        <w:color w:val="000000"/>
       </w:rPr>
       <w:tblPr/>
       <w:tcPr>
@@ -13428,7 +13429,7 @@
         <w:bCs/>
         <w:i w:val="0"/>
         <w:iCs w:val="0"/>
-        <w:color w:val="FFFFFF" w:themeColor="background1"/>
+        <w:color w:val="000000"/>
       </w:rPr>
       <w:tblPr/>
       <w:tcPr>
@@ -13449,7 +13450,7 @@
         <w:bCs/>
         <w:i w:val="0"/>
         <w:iCs w:val="0"/>
-        <w:color w:val="FFFFFF" w:themeColor="background1"/>
+        <w:color w:val="000000"/>
       </w:rPr>
       <w:tblPr/>
       <w:tcPr>
@@ -13470,7 +13471,7 @@
         <w:bCs/>
         <w:i w:val="0"/>
         <w:iCs w:val="0"/>
-        <w:color w:val="FFFFFF" w:themeColor="background1"/>
+        <w:color w:val="000000"/>
       </w:rPr>
       <w:tblPr/>
       <w:tcPr>
@@ -13489,7 +13490,7 @@
         <w:bCs/>
         <w:i w:val="0"/>
         <w:iCs w:val="0"/>
-        <w:color w:val="FFFFFF" w:themeColor="background1"/>
+        <w:color w:val="000000"/>
       </w:rPr>
       <w:tblPr/>
       <w:tcPr>
@@ -13542,7 +13543,7 @@
       <w:spacing w:after="0" w:line="240" w:lineRule="auto"/>
     </w:pPr>
     <w:rPr>
-      <w:color w:val="FFFFFF" w:themeColor="background1"/>
+      <w:color w:val="000000"/>
     </w:rPr>
     <w:tblPr>
       <w:tblStyleRowBandSize w:val="1"/>
@@ -13656,7 +13657,7 @@
       <w:spacing w:after="0" w:line="240" w:lineRule="auto"/>
     </w:pPr>
     <w:rPr>
-      <w:color w:val="FFFFFF" w:themeColor="background1"/>
+      <w:color w:val="000000"/>
     </w:rPr>
     <w:tblPr>
       <w:tblStyleRowBandSize w:val="1"/>
@@ -13770,7 +13771,7 @@
       <w:spacing w:after="0" w:line="240" w:lineRule="auto"/>
     </w:pPr>
     <w:rPr>
-      <w:color w:val="FFFFFF" w:themeColor="background1"/>
+      <w:color w:val="000000"/>
     </w:rPr>
     <w:tblPr>
       <w:tblStyleRowBandSize w:val="1"/>
@@ -13884,7 +13885,7 @@
       <w:spacing w:after="0" w:line="240" w:lineRule="auto"/>
     </w:pPr>
     <w:rPr>
-      <w:color w:val="FFFFFF" w:themeColor="background1"/>
+      <w:color w:val="000000"/>
     </w:rPr>
     <w:tblPr>
       <w:tblStyleRowBandSize w:val="1"/>
@@ -13998,7 +13999,7 @@
       <w:spacing w:after="0" w:line="240" w:lineRule="auto"/>
     </w:pPr>
     <w:rPr>
-      <w:color w:val="FFFFFF" w:themeColor="background1"/>
+      <w:color w:val="000000"/>
     </w:rPr>
     <w:tblPr>
       <w:tblStyleRowBandSize w:val="1"/>
@@ -14112,7 +14113,7 @@
       <w:spacing w:after="0" w:line="240" w:lineRule="auto"/>
     </w:pPr>
     <w:rPr>
-      <w:color w:val="FFFFFF" w:themeColor="background1"/>
+      <w:color w:val="000000"/>
     </w:rPr>
     <w:tblPr>
       <w:tblStyleRowBandSize w:val="1"/>
@@ -14226,7 +14227,7 @@
       <w:spacing w:after="0" w:line="240" w:lineRule="auto"/>
     </w:pPr>
     <w:rPr>
-      <w:color w:val="FFFFFF" w:themeColor="background1"/>
+      <w:color w:val="000000"/>
     </w:rPr>
     <w:tblPr>
       <w:tblStyleRowBandSize w:val="1"/>
@@ -14340,7 +14341,7 @@
       <w:spacing w:after="0" w:line="240" w:lineRule="auto"/>
     </w:pPr>
     <w:rPr>
-      <w:color w:val="000000" w:themeColor="text1"/>
+      <w:color w:val="000000"/>
     </w:rPr>
     <w:tblPr>
       <w:tblStyleRowBandSize w:val="1"/>
@@ -14386,7 +14387,7 @@
       <w:rPr>
         <w:b/>
         <w:bCs/>
-        <w:color w:val="FFFFFF" w:themeColor="background1"/>
+        <w:color w:val="000000"/>
       </w:rPr>
       <w:tblPr/>
       <w:tcPr>
@@ -14398,7 +14399,7 @@
     </w:tblStylePr>
     <w:tblStylePr w:type="firstCol">
       <w:rPr>
-        <w:color w:val="FFFFFF" w:themeColor="background1"/>
+        <w:color w:val="000000"/>
       </w:rPr>
       <w:tblPr/>
       <w:tcPr>
@@ -14415,7 +14416,7 @@
     </w:tblStylePr>
     <w:tblStylePr w:type="lastCol">
       <w:rPr>
-        <w:color w:val="FFFFFF" w:themeColor="background1"/>
+        <w:color w:val="000000"/>
       </w:rPr>
       <w:tblPr/>
       <w:tcPr>
@@ -14444,12 +14445,12 @@
     </w:tblStylePr>
     <w:tblStylePr w:type="neCell">
       <w:rPr>
-        <w:color w:val="000000" w:themeColor="text1"/>
+        <w:color w:val="000000"/>
       </w:rPr>
     </w:tblStylePr>
     <w:tblStylePr w:type="nwCell">
       <w:rPr>
-        <w:color w:val="000000" w:themeColor="text1"/>
+        <w:color w:val="000000"/>
       </w:rPr>
     </w:tblStylePr>
   </w:style>
@@ -14462,7 +14463,7 @@
       <w:spacing w:after="0" w:line="240" w:lineRule="auto"/>
     </w:pPr>
     <w:rPr>
-      <w:color w:val="000000" w:themeColor="text1"/>
+      <w:color w:val="000000"/>
     </w:rPr>
     <w:tblPr>
       <w:tblStyleRowBandSize w:val="1"/>
@@ -14508,7 +14509,7 @@
       <w:rPr>
         <w:b/>
         <w:bCs/>
-        <w:color w:val="FFFFFF" w:themeColor="background1"/>
+        <w:color w:val="000000"/>
       </w:rPr>
       <w:tblPr/>
       <w:tcPr>
@@ -14520,7 +14521,7 @@
     </w:tblStylePr>
     <w:tblStylePr w:type="firstCol">
       <w:rPr>
-        <w:color w:val="FFFFFF" w:themeColor="background1"/>
+        <w:color w:val="000000"/>
       </w:rPr>
       <w:tblPr/>
       <w:tcPr>
@@ -14537,7 +14538,7 @@
     </w:tblStylePr>
     <w:tblStylePr w:type="lastCol">
       <w:rPr>
-        <w:color w:val="FFFFFF" w:themeColor="background1"/>
+        <w:color w:val="000000"/>
       </w:rPr>
       <w:tblPr/>
       <w:tcPr>
@@ -14566,12 +14567,12 @@
     </w:tblStylePr>
     <w:tblStylePr w:type="neCell">
       <w:rPr>
-        <w:color w:val="000000" w:themeColor="text1"/>
+        <w:color w:val="000000"/>
       </w:rPr>
     </w:tblStylePr>
     <w:tblStylePr w:type="nwCell">
       <w:rPr>
-        <w:color w:val="000000" w:themeColor="text1"/>
+        <w:color w:val="000000"/>
       </w:rPr>
     </w:tblStylePr>
   </w:style>
@@ -14584,7 +14585,7 @@
       <w:spacing w:after="0" w:line="240" w:lineRule="auto"/>
     </w:pPr>
     <w:rPr>
-      <w:color w:val="000000" w:themeColor="text1"/>
+      <w:color w:val="000000"/>
     </w:rPr>
     <w:tblPr>
       <w:tblStyleRowBandSize w:val="1"/>
@@ -14630,7 +14631,7 @@
       <w:rPr>
         <w:b/>
         <w:bCs/>
-        <w:color w:val="FFFFFF" w:themeColor="background1"/>
+        <w:color w:val="000000"/>
       </w:rPr>
       <w:tblPr/>
       <w:tcPr>
@@ -14642,7 +14643,7 @@
     </w:tblStylePr>
     <w:tblStylePr w:type="firstCol">
       <w:rPr>
-        <w:color w:val="FFFFFF" w:themeColor="background1"/>
+        <w:color w:val="000000"/>
       </w:rPr>
       <w:tblPr/>
       <w:tcPr>
@@ -14659,7 +14660,7 @@
     </w:tblStylePr>
     <w:tblStylePr w:type="lastCol">
       <w:rPr>
-        <w:color w:val="FFFFFF" w:themeColor="background1"/>
+        <w:color w:val="000000"/>
       </w:rPr>
       <w:tblPr/>
       <w:tcPr>
@@ -14688,12 +14689,12 @@
     </w:tblStylePr>
     <w:tblStylePr w:type="neCell">
       <w:rPr>
-        <w:color w:val="000000" w:themeColor="text1"/>
+        <w:color w:val="000000"/>
       </w:rPr>
     </w:tblStylePr>
     <w:tblStylePr w:type="nwCell">
       <w:rPr>
-        <w:color w:val="000000" w:themeColor="text1"/>
+        <w:color w:val="000000"/>
       </w:rPr>
     </w:tblStylePr>
   </w:style>
@@ -14706,7 +14707,7 @@
       <w:spacing w:after="0" w:line="240" w:lineRule="auto"/>
     </w:pPr>
     <w:rPr>
-      <w:color w:val="000000" w:themeColor="text1"/>
+      <w:color w:val="000000"/>
     </w:rPr>
     <w:tblPr>
       <w:tblStyleRowBandSize w:val="1"/>
@@ -14752,7 +14753,7 @@
       <w:rPr>
         <w:b/>
         <w:bCs/>
-        <w:color w:val="FFFFFF" w:themeColor="background1"/>
+        <w:color w:val="000000"/>
       </w:rPr>
       <w:tblPr/>
       <w:tcPr>
@@ -14764,7 +14765,7 @@
     </w:tblStylePr>
     <w:tblStylePr w:type="firstCol">
       <w:rPr>
-        <w:color w:val="FFFFFF" w:themeColor="background1"/>
+        <w:color w:val="000000"/>
       </w:rPr>
       <w:tblPr/>
       <w:tcPr>
@@ -14781,7 +14782,7 @@
     </w:tblStylePr>
     <w:tblStylePr w:type="lastCol">
       <w:rPr>
-        <w:color w:val="FFFFFF" w:themeColor="background1"/>
+        <w:color w:val="000000"/>
       </w:rPr>
       <w:tblPr/>
       <w:tcPr>
@@ -14818,7 +14819,7 @@
       <w:spacing w:after="0" w:line="240" w:lineRule="auto"/>
     </w:pPr>
     <w:rPr>
-      <w:color w:val="000000" w:themeColor="text1"/>
+      <w:color w:val="000000"/>
     </w:rPr>
     <w:tblPr>
       <w:tblStyleRowBandSize w:val="1"/>
@@ -14864,7 +14865,7 @@
       <w:rPr>
         <w:b/>
         <w:bCs/>
-        <w:color w:val="FFFFFF" w:themeColor="background1"/>
+        <w:color w:val="000000"/>
       </w:rPr>
       <w:tblPr/>
       <w:tcPr>
@@ -14876,7 +14877,7 @@
     </w:tblStylePr>
     <w:tblStylePr w:type="firstCol">
       <w:rPr>
-        <w:color w:val="FFFFFF" w:themeColor="background1"/>
+        <w:color w:val="000000"/>
       </w:rPr>
       <w:tblPr/>
       <w:tcPr>
@@ -14893,7 +14894,7 @@
     </w:tblStylePr>
     <w:tblStylePr w:type="lastCol">
       <w:rPr>
-        <w:color w:val="FFFFFF" w:themeColor="background1"/>
+        <w:color w:val="000000"/>
       </w:rPr>
       <w:tblPr/>
       <w:tcPr>
@@ -14922,12 +14923,12 @@
     </w:tblStylePr>
     <w:tblStylePr w:type="neCell">
       <w:rPr>
-        <w:color w:val="000000" w:themeColor="text1"/>
+        <w:color w:val="000000"/>
       </w:rPr>
     </w:tblStylePr>
     <w:tblStylePr w:type="nwCell">
       <w:rPr>
-        <w:color w:val="000000" w:themeColor="text1"/>
+        <w:color w:val="000000"/>
       </w:rPr>
     </w:tblStylePr>
   </w:style>
@@ -14940,7 +14941,7 @@
       <w:spacing w:after="0" w:line="240" w:lineRule="auto"/>
     </w:pPr>
     <w:rPr>
-      <w:color w:val="000000" w:themeColor="text1"/>
+      <w:color w:val="000000"/>
     </w:rPr>
     <w:tblPr>
       <w:tblStyleRowBandSize w:val="1"/>
@@ -14986,7 +14987,7 @@
       <w:rPr>
         <w:b/>
         <w:bCs/>
-        <w:color w:val="FFFFFF" w:themeColor="background1"/>
+        <w:color w:val="000000"/>
       </w:rPr>
       <w:tblPr/>
       <w:tcPr>
@@ -14998,7 +14999,7 @@
     </w:tblStylePr>
     <w:tblStylePr w:type="firstCol">
       <w:rPr>
-        <w:color w:val="FFFFFF" w:themeColor="background1"/>
+        <w:color w:val="000000"/>
       </w:rPr>
       <w:tblPr/>
       <w:tcPr>
@@ -15015,7 +15016,7 @@
     </w:tblStylePr>
     <w:tblStylePr w:type="lastCol">
       <w:rPr>
-        <w:color w:val="FFFFFF" w:themeColor="background1"/>
+        <w:color w:val="000000"/>
       </w:rPr>
       <w:tblPr/>
       <w:tcPr>
@@ -15044,12 +15045,12 @@
     </w:tblStylePr>
     <w:tblStylePr w:type="neCell">
       <w:rPr>
-        <w:color w:val="000000" w:themeColor="text1"/>
+        <w:color w:val="000000"/>
       </w:rPr>
     </w:tblStylePr>
     <w:tblStylePr w:type="nwCell">
       <w:rPr>
-        <w:color w:val="000000" w:themeColor="text1"/>
+        <w:color w:val="000000"/>
       </w:rPr>
     </w:tblStylePr>
   </w:style>
@@ -15062,7 +15063,7 @@
       <w:spacing w:after="0" w:line="240" w:lineRule="auto"/>
     </w:pPr>
     <w:rPr>
-      <w:color w:val="000000" w:themeColor="text1"/>
+      <w:color w:val="000000"/>
     </w:rPr>
     <w:tblPr>
       <w:tblStyleRowBandSize w:val="1"/>
@@ -15108,7 +15109,7 @@
       <w:rPr>
         <w:b/>
         <w:bCs/>
-        <w:color w:val="FFFFFF" w:themeColor="background1"/>
+        <w:color w:val="000000"/>
       </w:rPr>
       <w:tblPr/>
       <w:tcPr>
@@ -15120,7 +15121,7 @@
     </w:tblStylePr>
     <w:tblStylePr w:type="firstCol">
       <w:rPr>
-        <w:color w:val="FFFFFF" w:themeColor="background1"/>
+        <w:color w:val="000000"/>
       </w:rPr>
       <w:tblPr/>
       <w:tcPr>
@@ -15137,7 +15138,7 @@
     </w:tblStylePr>
     <w:tblStylePr w:type="lastCol">
       <w:rPr>
-        <w:color w:val="FFFFFF" w:themeColor="background1"/>
+        <w:color w:val="000000"/>
       </w:rPr>
       <w:tblPr/>
       <w:tcPr>
@@ -15166,12 +15167,12 @@
     </w:tblStylePr>
     <w:tblStylePr w:type="neCell">
       <w:rPr>
-        <w:color w:val="000000" w:themeColor="text1"/>
+        <w:color w:val="000000"/>
       </w:rPr>
     </w:tblStylePr>
     <w:tblStylePr w:type="nwCell">
       <w:rPr>
-        <w:color w:val="000000" w:themeColor="text1"/>
+        <w:color w:val="000000"/>
       </w:rPr>
     </w:tblStylePr>
   </w:style>
@@ -15184,7 +15185,7 @@
       <w:spacing w:after="0" w:line="240" w:lineRule="auto"/>
     </w:pPr>
     <w:rPr>
-      <w:color w:val="000000" w:themeColor="text1"/>
+      <w:color w:val="000000"/>
     </w:rPr>
     <w:tblPr>
       <w:tblStyleRowBandSize w:val="1"/>
@@ -15204,7 +15205,7 @@
       <w:rPr>
         <w:b/>
         <w:bCs/>
-        <w:color w:val="FFFFFF" w:themeColor="background1"/>
+        <w:color w:val="000000"/>
       </w:rPr>
       <w:tblPr/>
       <w:tcPr>
@@ -15218,7 +15219,7 @@
       <w:rPr>
         <w:b/>
         <w:bCs/>
-        <w:color w:val="9E3A38" w:themeColor="accent2" w:themeShade="CC"/>
+        <w:color w:val="000000"/>
       </w:rPr>
       <w:tblPr/>
       <w:tcPr>
@@ -15270,7 +15271,7 @@
       <w:spacing w:after="0" w:line="240" w:lineRule="auto"/>
     </w:pPr>
     <w:rPr>
-      <w:color w:val="000000" w:themeColor="text1"/>
+      <w:color w:val="000000"/>
     </w:rPr>
     <w:tblPr>
       <w:tblStyleRowBandSize w:val="1"/>
@@ -15290,7 +15291,7 @@
       <w:rPr>
         <w:b/>
         <w:bCs/>
-        <w:color w:val="FFFFFF" w:themeColor="background1"/>
+        <w:color w:val="000000"/>
       </w:rPr>
       <w:tblPr/>
       <w:tcPr>
@@ -15304,7 +15305,7 @@
       <w:rPr>
         <w:b/>
         <w:bCs/>
-        <w:color w:val="9E3A38" w:themeColor="accent2" w:themeShade="CC"/>
+        <w:color w:val="000000"/>
       </w:rPr>
       <w:tblPr/>
       <w:tcPr>
@@ -15356,7 +15357,7 @@
       <w:spacing w:after="0" w:line="240" w:lineRule="auto"/>
     </w:pPr>
     <w:rPr>
-      <w:color w:val="000000" w:themeColor="text1"/>
+      <w:color w:val="000000"/>
     </w:rPr>
     <w:tblPr>
       <w:tblStyleRowBandSize w:val="1"/>
@@ -15376,7 +15377,7 @@
       <w:rPr>
         <w:b/>
         <w:bCs/>
-        <w:color w:val="FFFFFF" w:themeColor="background1"/>
+        <w:color w:val="000000"/>
       </w:rPr>
       <w:tblPr/>
       <w:tcPr>
@@ -15390,7 +15391,7 @@
       <w:rPr>
         <w:b/>
         <w:bCs/>
-        <w:color w:val="9E3A38" w:themeColor="accent2" w:themeShade="CC"/>
+        <w:color w:val="000000"/>
       </w:rPr>
       <w:tblPr/>
       <w:tcPr>
@@ -15442,7 +15443,7 @@
       <w:spacing w:after="0" w:line="240" w:lineRule="auto"/>
     </w:pPr>
     <w:rPr>
-      <w:color w:val="000000" w:themeColor="text1"/>
+      <w:color w:val="000000"/>
     </w:rPr>
     <w:tblPr>
       <w:tblStyleRowBandSize w:val="1"/>
@@ -15462,7 +15463,7 @@
       <w:rPr>
         <w:b/>
         <w:bCs/>
-        <w:color w:val="FFFFFF" w:themeColor="background1"/>
+        <w:color w:val="000000"/>
       </w:rPr>
       <w:tblPr/>
       <w:tcPr>
@@ -15476,7 +15477,7 @@
       <w:rPr>
         <w:b/>
         <w:bCs/>
-        <w:color w:val="664E82" w:themeColor="accent4" w:themeShade="CC"/>
+        <w:color w:val="000000"/>
       </w:rPr>
       <w:tblPr/>
       <w:tcPr>
@@ -15528,7 +15529,7 @@
       <w:spacing w:after="0" w:line="240" w:lineRule="auto"/>
     </w:pPr>
     <w:rPr>
-      <w:color w:val="000000" w:themeColor="text1"/>
+      <w:color w:val="000000"/>
     </w:rPr>
     <w:tblPr>
       <w:tblStyleRowBandSize w:val="1"/>
@@ -15548,7 +15549,7 @@
       <w:rPr>
         <w:b/>
         <w:bCs/>
-        <w:color w:val="FFFFFF" w:themeColor="background1"/>
+        <w:color w:val="000000"/>
       </w:rPr>
       <w:tblPr/>
       <w:tcPr>
@@ -15562,7 +15563,7 @@
       <w:rPr>
         <w:b/>
         <w:bCs/>
-        <w:color w:val="7E9C40" w:themeColor="accent3" w:themeShade="CC"/>
+        <w:color w:val="000000"/>
       </w:rPr>
       <w:tblPr/>
       <w:tcPr>
@@ -15614,7 +15615,7 @@
       <w:spacing w:after="0" w:line="240" w:lineRule="auto"/>
     </w:pPr>
     <w:rPr>
-      <w:color w:val="000000" w:themeColor="text1"/>
+      <w:color w:val="000000"/>
     </w:rPr>
     <w:tblPr>
       <w:tblStyleRowBandSize w:val="1"/>
@@ -15634,7 +15635,7 @@
       <w:rPr>
         <w:b/>
         <w:bCs/>
-        <w:color w:val="FFFFFF" w:themeColor="background1"/>
+        <w:color w:val="000000"/>
       </w:rPr>
       <w:tblPr/>
       <w:tcPr>
@@ -15648,7 +15649,7 @@
       <w:rPr>
         <w:b/>
         <w:bCs/>
-        <w:color w:val="F2730A" w:themeColor="accent6" w:themeShade="CC"/>
+        <w:color w:val="000000"/>
       </w:rPr>
       <w:tblPr/>
       <w:tcPr>
@@ -15700,7 +15701,7 @@
       <w:spacing w:after="0" w:line="240" w:lineRule="auto"/>
     </w:pPr>
     <w:rPr>
-      <w:color w:val="000000" w:themeColor="text1"/>
+      <w:color w:val="000000"/>
     </w:rPr>
     <w:tblPr>
       <w:tblStyleRowBandSize w:val="1"/>
@@ -15720,7 +15721,7 @@
       <w:rPr>
         <w:b/>
         <w:bCs/>
-        <w:color w:val="FFFFFF" w:themeColor="background1"/>
+        <w:color w:val="000000"/>
       </w:rPr>
       <w:tblPr/>
       <w:tcPr>
@@ -15734,7 +15735,7 @@
       <w:rPr>
         <w:b/>
         <w:bCs/>
-        <w:color w:val="348DA5" w:themeColor="accent5" w:themeShade="CC"/>
+        <w:color w:val="000000"/>
       </w:rPr>
       <w:tblPr/>
       <w:tcPr>
@@ -15786,7 +15787,7 @@
       <w:spacing w:after="0" w:line="240" w:lineRule="auto"/>
     </w:pPr>
     <w:rPr>
-      <w:color w:val="000000" w:themeColor="text1"/>
+      <w:color w:val="000000"/>
     </w:rPr>
     <w:tblPr>
       <w:tblStyleRowBandSize w:val="1"/>
@@ -15819,7 +15820,7 @@
       <w:rPr>
         <w:b/>
         <w:bCs/>
-        <w:color w:val="000000" w:themeColor="text1"/>
+        <w:color w:val="000000"/>
       </w:rPr>
       <w:tblPr/>
       <w:tcPr>
@@ -15828,7 +15829,7 @@
     </w:tblStylePr>
     <w:tblStylePr w:type="firstCol">
       <w:rPr>
-        <w:color w:val="FFFFFF" w:themeColor="background1"/>
+        <w:color w:val="000000"/>
       </w:rPr>
       <w:tblPr/>
       <w:tcPr>
@@ -15837,7 +15838,7 @@
     </w:tblStylePr>
     <w:tblStylePr w:type="lastCol">
       <w:rPr>
-        <w:color w:val="FFFFFF" w:themeColor="background1"/>
+        <w:color w:val="000000"/>
       </w:rPr>
       <w:tblPr/>
       <w:tcPr>
@@ -15866,7 +15867,7 @@
       <w:spacing w:after="0" w:line="240" w:lineRule="auto"/>
     </w:pPr>
     <w:rPr>
-      <w:color w:val="000000" w:themeColor="text1"/>
+      <w:color w:val="000000"/>
     </w:rPr>
     <w:tblPr>
       <w:tblStyleRowBandSize w:val="1"/>
@@ -15899,7 +15900,7 @@
       <w:rPr>
         <w:b/>
         <w:bCs/>
-        <w:color w:val="000000" w:themeColor="text1"/>
+        <w:color w:val="000000"/>
       </w:rPr>
       <w:tblPr/>
       <w:tcPr>
@@ -15908,7 +15909,7 @@
     </w:tblStylePr>
     <w:tblStylePr w:type="firstCol">
       <w:rPr>
-        <w:color w:val="FFFFFF" w:themeColor="background1"/>
+        <w:color w:val="000000"/>
       </w:rPr>
       <w:tblPr/>
       <w:tcPr>
@@ -15917,7 +15918,7 @@
     </w:tblStylePr>
     <w:tblStylePr w:type="lastCol">
       <w:rPr>
-        <w:color w:val="FFFFFF" w:themeColor="background1"/>
+        <w:color w:val="000000"/>
       </w:rPr>
       <w:tblPr/>
       <w:tcPr>
@@ -15946,7 +15947,7 @@
       <w:spacing w:after="0" w:line="240" w:lineRule="auto"/>
     </w:pPr>
     <w:rPr>
-      <w:color w:val="000000" w:themeColor="text1"/>
+      <w:color w:val="000000"/>
     </w:rPr>
     <w:tblPr>
       <w:tblStyleRowBandSize w:val="1"/>
@@ -15979,7 +15980,7 @@
       <w:rPr>
         <w:b/>
         <w:bCs/>
-        <w:color w:val="000000" w:themeColor="text1"/>
+        <w:color w:val="000000"/>
       </w:rPr>
       <w:tblPr/>
       <w:tcPr>
@@ -15988,7 +15989,7 @@
     </w:tblStylePr>
     <w:tblStylePr w:type="firstCol">
       <w:rPr>
-        <w:color w:val="FFFFFF" w:themeColor="background1"/>
+        <w:color w:val="000000"/>
       </w:rPr>
       <w:tblPr/>
       <w:tcPr>
@@ -15997,7 +15998,7 @@
     </w:tblStylePr>
     <w:tblStylePr w:type="lastCol">
       <w:rPr>
-        <w:color w:val="FFFFFF" w:themeColor="background1"/>
+        <w:color w:val="000000"/>
       </w:rPr>
       <w:tblPr/>
       <w:tcPr>
@@ -16026,7 +16027,7 @@
       <w:spacing w:after="0" w:line="240" w:lineRule="auto"/>
     </w:pPr>
     <w:rPr>
-      <w:color w:val="000000" w:themeColor="text1"/>
+      <w:color w:val="000000"/>
     </w:rPr>
     <w:tblPr>
       <w:tblStyleRowBandSize w:val="1"/>
@@ -16059,7 +16060,7 @@
       <w:rPr>
         <w:b/>
         <w:bCs/>
-        <w:color w:val="000000" w:themeColor="text1"/>
+        <w:color w:val="000000"/>
       </w:rPr>
       <w:tblPr/>
       <w:tcPr>
@@ -16068,7 +16069,7 @@
     </w:tblStylePr>
     <w:tblStylePr w:type="firstCol">
       <w:rPr>
-        <w:color w:val="FFFFFF" w:themeColor="background1"/>
+        <w:color w:val="000000"/>
       </w:rPr>
       <w:tblPr/>
       <w:tcPr>
@@ -16077,7 +16078,7 @@
     </w:tblStylePr>
     <w:tblStylePr w:type="lastCol">
       <w:rPr>
-        <w:color w:val="FFFFFF" w:themeColor="background1"/>
+        <w:color w:val="000000"/>
       </w:rPr>
       <w:tblPr/>
       <w:tcPr>
@@ -16106,7 +16107,7 @@
       <w:spacing w:after="0" w:line="240" w:lineRule="auto"/>
     </w:pPr>
     <w:rPr>
-      <w:color w:val="000000" w:themeColor="text1"/>
+      <w:color w:val="000000"/>
     </w:rPr>
     <w:tblPr>
       <w:tblStyleRowBandSize w:val="1"/>
@@ -16139,7 +16140,7 @@
       <w:rPr>
         <w:b/>
         <w:bCs/>
-        <w:color w:val="000000" w:themeColor="text1"/>
+        <w:color w:val="000000"/>
       </w:rPr>
       <w:tblPr/>
       <w:tcPr>
@@ -16148,7 +16149,7 @@
     </w:tblStylePr>
     <w:tblStylePr w:type="firstCol">
       <w:rPr>
-        <w:color w:val="FFFFFF" w:themeColor="background1"/>
+        <w:color w:val="000000"/>
       </w:rPr>
       <w:tblPr/>
       <w:tcPr>
@@ -16157,7 +16158,7 @@
     </w:tblStylePr>
     <w:tblStylePr w:type="lastCol">
       <w:rPr>
-        <w:color w:val="FFFFFF" w:themeColor="background1"/>
+        <w:color w:val="000000"/>
       </w:rPr>
       <w:tblPr/>
       <w:tcPr>
@@ -16186,7 +16187,7 @@
       <w:spacing w:after="0" w:line="240" w:lineRule="auto"/>
     </w:pPr>
     <w:rPr>
-      <w:color w:val="000000" w:themeColor="text1"/>
+      <w:color w:val="000000"/>
     </w:rPr>
     <w:tblPr>
       <w:tblStyleRowBandSize w:val="1"/>
@@ -16219,7 +16220,7 @@
       <w:rPr>
         <w:b/>
         <w:bCs/>
-        <w:color w:val="000000" w:themeColor="text1"/>
+        <w:color w:val="000000"/>
       </w:rPr>
       <w:tblPr/>
       <w:tcPr>
@@ -16228,7 +16229,7 @@
     </w:tblStylePr>
     <w:tblStylePr w:type="firstCol">
       <w:rPr>
-        <w:color w:val="FFFFFF" w:themeColor="background1"/>
+        <w:color w:val="000000"/>
       </w:rPr>
       <w:tblPr/>
       <w:tcPr>
@@ -16237,7 +16238,7 @@
     </w:tblStylePr>
     <w:tblStylePr w:type="lastCol">
       <w:rPr>
-        <w:color w:val="FFFFFF" w:themeColor="background1"/>
+        <w:color w:val="000000"/>
       </w:rPr>
       <w:tblPr/>
       <w:tcPr>
@@ -16266,7 +16267,7 @@
       <w:spacing w:after="0" w:line="240" w:lineRule="auto"/>
     </w:pPr>
     <w:rPr>
-      <w:color w:val="000000" w:themeColor="text1"/>
+      <w:color w:val="000000"/>
     </w:rPr>
     <w:tblPr>
       <w:tblStyleRowBandSize w:val="1"/>
@@ -16299,7 +16300,7 @@
       <w:rPr>
         <w:b/>
         <w:bCs/>
-        <w:color w:val="000000" w:themeColor="text1"/>
+        <w:color w:val="000000"/>
       </w:rPr>
       <w:tblPr/>
       <w:tcPr>
@@ -16308,7 +16309,7 @@
     </w:tblStylePr>
     <w:tblStylePr w:type="firstCol">
       <w:rPr>
-        <w:color w:val="FFFFFF" w:themeColor="background1"/>
+        <w:color w:val="000000"/>
       </w:rPr>
       <w:tblPr/>
       <w:tcPr>
@@ -16317,7 +16318,7 @@
     </w:tblStylePr>
     <w:tblStylePr w:type="lastCol">
       <w:rPr>
-        <w:color w:val="FFFFFF" w:themeColor="background1"/>
+        <w:color w:val="000000"/>
       </w:rPr>
       <w:tblPr/>
       <w:tcPr>

</xml_diff>